<commit_message>
Fix engine issues, add DDM/FCFF/EAS sections, update calculations and exports
</commit_message>
<xml_diff>
--- a/WOLF_Engine_Complete_Overview.docx
+++ b/WOLF_Engine_Complete_Overview.docx
@@ -6346,6 +6346,3300 @@
         <w:t>Mobile-responsive layout optimizations</w:t>
       </w:r>
     </w:p>
+    <w:p>
+      <w:r>
+        <w:br w:type="page"/>
+      </w:r>
+    </w:p>
+    <w:p>
+      <w:pPr>
+        <w:pStyle w:val="Heading1"/>
+      </w:pPr>
+      <w:r>
+        <w:t>Appendix A: FCFF Three-Way Cross-Verification</w:t>
+      </w:r>
+    </w:p>
+    <w:p>
+      <w:r>
+        <w:t>File: src/utils/valuationEngine.ts - calculateFCFFVerification()</w:t>
+      </w:r>
+    </w:p>
+    <w:p>
+      <w:r>
+        <w:t>All three methods must produce identical FCFF results within a 1% tolerance. This is a critical audit check that ensures internal consistency of financial data.</w:t>
+      </w:r>
+    </w:p>
+    <w:tbl>
+      <w:tblPr>
+        <w:tblStyle w:val="LightGrid-Accent1"/>
+        <w:tblW w:type="auto" w:w="0"/>
+        <w:jc w:val="center"/>
+        <w:tblLook w:firstColumn="1" w:firstRow="1" w:lastColumn="0" w:lastRow="0" w:noHBand="0" w:noVBand="1" w:val="04A0"/>
+      </w:tblPr>
+      <w:tblGrid>
+        <w:gridCol w:w="2880"/>
+        <w:gridCol w:w="2880"/>
+        <w:gridCol w:w="2880"/>
+      </w:tblGrid>
+      <w:tr>
+        <w:tc>
+          <w:tcPr>
+            <w:tcW w:type="dxa" w:w="2880"/>
+          </w:tcPr>
+          <w:p>
+            <w:r>
+              <w:rPr>
+                <w:b/>
+                <w:sz w:val="18"/>
+              </w:rPr>
+              <w:t>Method</w:t>
+            </w:r>
+          </w:p>
+        </w:tc>
+        <w:tc>
+          <w:tcPr>
+            <w:tcW w:type="dxa" w:w="2880"/>
+          </w:tcPr>
+          <w:p>
+            <w:r>
+              <w:rPr>
+                <w:b/>
+                <w:sz w:val="18"/>
+              </w:rPr>
+              <w:t>Formula</w:t>
+            </w:r>
+          </w:p>
+        </w:tc>
+        <w:tc>
+          <w:tcPr>
+            <w:tcW w:type="dxa" w:w="2880"/>
+          </w:tcPr>
+          <w:p>
+            <w:r>
+              <w:rPr>
+                <w:b/>
+                <w:sz w:val="18"/>
+              </w:rPr>
+              <w:t>Route</w:t>
+            </w:r>
+          </w:p>
+        </w:tc>
+      </w:tr>
+      <w:tr>
+        <w:tc>
+          <w:tcPr>
+            <w:tcW w:type="dxa" w:w="2880"/>
+          </w:tcPr>
+          <w:p>
+            <w:r>
+              <w:rPr>
+                <w:sz w:val="18"/>
+              </w:rPr>
+              <w:t>Method 1 (NOPAT)</w:t>
+            </w:r>
+          </w:p>
+        </w:tc>
+        <w:tc>
+          <w:tcPr>
+            <w:tcW w:type="dxa" w:w="2880"/>
+          </w:tcPr>
+          <w:p>
+            <w:r>
+              <w:rPr>
+                <w:sz w:val="18"/>
+              </w:rPr>
+              <w:t>EBIT x (1-t) + D&amp;A - CapEx - Delta WC</w:t>
+            </w:r>
+          </w:p>
+        </w:tc>
+        <w:tc>
+          <w:tcPr>
+            <w:tcW w:type="dxa" w:w="2880"/>
+          </w:tcPr>
+          <w:p>
+            <w:r>
+              <w:rPr>
+                <w:sz w:val="18"/>
+              </w:rPr>
+              <w:t>Primary</w:t>
+            </w:r>
+          </w:p>
+        </w:tc>
+      </w:tr>
+      <w:tr>
+        <w:tc>
+          <w:tcPr>
+            <w:tcW w:type="dxa" w:w="2880"/>
+          </w:tcPr>
+          <w:p>
+            <w:r>
+              <w:rPr>
+                <w:sz w:val="18"/>
+              </w:rPr>
+              <w:t>Method 2 (EBITDA)</w:t>
+            </w:r>
+          </w:p>
+        </w:tc>
+        <w:tc>
+          <w:tcPr>
+            <w:tcW w:type="dxa" w:w="2880"/>
+          </w:tcPr>
+          <w:p>
+            <w:r>
+              <w:rPr>
+                <w:sz w:val="18"/>
+              </w:rPr>
+              <w:t>EBITDA x (1-t) + D&amp;A x t - CapEx - Delta WC</w:t>
+            </w:r>
+          </w:p>
+        </w:tc>
+        <w:tc>
+          <w:tcPr>
+            <w:tcW w:type="dxa" w:w="2880"/>
+          </w:tcPr>
+          <w:p>
+            <w:r>
+              <w:rPr>
+                <w:sz w:val="18"/>
+              </w:rPr>
+              <w:t>Cross-check</w:t>
+            </w:r>
+          </w:p>
+        </w:tc>
+      </w:tr>
+      <w:tr>
+        <w:tc>
+          <w:tcPr>
+            <w:tcW w:type="dxa" w:w="2880"/>
+          </w:tcPr>
+          <w:p>
+            <w:r>
+              <w:rPr>
+                <w:sz w:val="18"/>
+              </w:rPr>
+              <w:t>Method 3 (Net Income)</w:t>
+            </w:r>
+          </w:p>
+        </w:tc>
+        <w:tc>
+          <w:tcPr>
+            <w:tcW w:type="dxa" w:w="2880"/>
+          </w:tcPr>
+          <w:p>
+            <w:r>
+              <w:rPr>
+                <w:sz w:val="18"/>
+              </w:rPr>
+              <w:t>NI + Interest x (1-t) + D&amp;A - CapEx - Delta WC</w:t>
+            </w:r>
+          </w:p>
+        </w:tc>
+        <w:tc>
+          <w:tcPr>
+            <w:tcW w:type="dxa" w:w="2880"/>
+          </w:tcPr>
+          <w:p>
+            <w:r>
+              <w:rPr>
+                <w:sz w:val="18"/>
+              </w:rPr>
+              <w:t>Cross-check</w:t>
+            </w:r>
+          </w:p>
+        </w:tc>
+      </w:tr>
+    </w:tbl>
+    <w:p/>
+    <w:p>
+      <w:r>
+        <w:t>The FCFFVerification interface returns: method1, method2, method3 values, allMatch boolean, and tolerance percentage. The UI displays a reconciliation table in the FCFFReconciliation.tsx component with color-coded match indicators.</w:t>
+      </w:r>
+    </w:p>
+    <w:p>
+      <w:pPr>
+        <w:pStyle w:val="Heading1"/>
+      </w:pPr>
+      <w:r>
+        <w:t>Appendix B: Dividend Discount Models (DDM)</w:t>
+      </w:r>
+    </w:p>
+    <w:p>
+      <w:r>
+        <w:t>File: src/utils/valuationEngine.ts - calculateDDM()</w:t>
+      </w:r>
+    </w:p>
+    <w:p>
+      <w:r>
+        <w:t>Three DDM variants are implemented. All discount at Cost of Equity (Ke), NOT WACC, since DDM values equity directly. DDM is only applicable when dividendsPerShare &gt; 0.</w:t>
+      </w:r>
+    </w:p>
+    <w:tbl>
+      <w:tblPr>
+        <w:tblStyle w:val="LightGrid-Accent1"/>
+        <w:tblW w:type="auto" w:w="0"/>
+        <w:jc w:val="center"/>
+        <w:tblLook w:firstColumn="1" w:firstRow="1" w:lastColumn="0" w:lastRow="0" w:noHBand="0" w:noVBand="1" w:val="04A0"/>
+      </w:tblPr>
+      <w:tblGrid>
+        <w:gridCol w:w="2880"/>
+        <w:gridCol w:w="2880"/>
+        <w:gridCol w:w="2880"/>
+      </w:tblGrid>
+      <w:tr>
+        <w:tc>
+          <w:tcPr>
+            <w:tcW w:type="dxa" w:w="2880"/>
+          </w:tcPr>
+          <w:p>
+            <w:r>
+              <w:rPr>
+                <w:b/>
+                <w:sz w:val="18"/>
+              </w:rPr>
+              <w:t>Model</w:t>
+            </w:r>
+          </w:p>
+        </w:tc>
+        <w:tc>
+          <w:tcPr>
+            <w:tcW w:type="dxa" w:w="2880"/>
+          </w:tcPr>
+          <w:p>
+            <w:r>
+              <w:rPr>
+                <w:b/>
+                <w:sz w:val="18"/>
+              </w:rPr>
+              <w:t>Formula</w:t>
+            </w:r>
+          </w:p>
+        </w:tc>
+        <w:tc>
+          <w:tcPr>
+            <w:tcW w:type="dxa" w:w="2880"/>
+          </w:tcPr>
+          <w:p>
+            <w:r>
+              <w:rPr>
+                <w:b/>
+                <w:sz w:val="18"/>
+              </w:rPr>
+              <w:t>Use Case</w:t>
+            </w:r>
+          </w:p>
+        </w:tc>
+      </w:tr>
+      <w:tr>
+        <w:tc>
+          <w:tcPr>
+            <w:tcW w:type="dxa" w:w="2880"/>
+          </w:tcPr>
+          <w:p>
+            <w:r>
+              <w:rPr>
+                <w:sz w:val="18"/>
+              </w:rPr>
+              <w:t>Gordon Growth</w:t>
+            </w:r>
+          </w:p>
+        </w:tc>
+        <w:tc>
+          <w:tcPr>
+            <w:tcW w:type="dxa" w:w="2880"/>
+          </w:tcPr>
+          <w:p>
+            <w:r>
+              <w:rPr>
+                <w:sz w:val="18"/>
+              </w:rPr>
+              <w:t>DPS x (1+g) / (Ke - g)</w:t>
+            </w:r>
+          </w:p>
+        </w:tc>
+        <w:tc>
+          <w:tcPr>
+            <w:tcW w:type="dxa" w:w="2880"/>
+          </w:tcPr>
+          <w:p>
+            <w:r>
+              <w:rPr>
+                <w:sz w:val="18"/>
+              </w:rPr>
+              <w:t>Stable dividend growers</w:t>
+            </w:r>
+          </w:p>
+        </w:tc>
+      </w:tr>
+      <w:tr>
+        <w:tc>
+          <w:tcPr>
+            <w:tcW w:type="dxa" w:w="2880"/>
+          </w:tcPr>
+          <w:p>
+            <w:r>
+              <w:rPr>
+                <w:sz w:val="18"/>
+              </w:rPr>
+              <w:t>Two-Stage</w:t>
+            </w:r>
+          </w:p>
+        </w:tc>
+        <w:tc>
+          <w:tcPr>
+            <w:tcW w:type="dxa" w:w="2880"/>
+          </w:tcPr>
+          <w:p>
+            <w:r>
+              <w:rPr>
+                <w:sz w:val="18"/>
+              </w:rPr>
+              <w:t>PV(high-growth dividends) + PV(stable terminal)</w:t>
+            </w:r>
+          </w:p>
+        </w:tc>
+        <w:tc>
+          <w:tcPr>
+            <w:tcW w:type="dxa" w:w="2880"/>
+          </w:tcPr>
+          <w:p>
+            <w:r>
+              <w:rPr>
+                <w:sz w:val="18"/>
+              </w:rPr>
+              <w:t>Companies transitioning growth rates</w:t>
+            </w:r>
+          </w:p>
+        </w:tc>
+      </w:tr>
+      <w:tr>
+        <w:tc>
+          <w:tcPr>
+            <w:tcW w:type="dxa" w:w="2880"/>
+          </w:tcPr>
+          <w:p>
+            <w:r>
+              <w:rPr>
+                <w:sz w:val="18"/>
+              </w:rPr>
+              <w:t>H-Model</w:t>
+            </w:r>
+          </w:p>
+        </w:tc>
+        <w:tc>
+          <w:tcPr>
+            <w:tcW w:type="dxa" w:w="2880"/>
+          </w:tcPr>
+          <w:p>
+            <w:r>
+              <w:rPr>
+                <w:sz w:val="18"/>
+              </w:rPr>
+              <w:t>DPS x (1+gL) / (Ke-gL) + DPS x H x (gS-gL) / (Ke-gL)</w:t>
+            </w:r>
+          </w:p>
+        </w:tc>
+        <w:tc>
+          <w:tcPr>
+            <w:tcW w:type="dxa" w:w="2880"/>
+          </w:tcPr>
+          <w:p>
+            <w:r>
+              <w:rPr>
+                <w:sz w:val="18"/>
+              </w:rPr>
+              <w:t>Gradually declining growth</w:t>
+            </w:r>
+          </w:p>
+        </w:tc>
+      </w:tr>
+    </w:tbl>
+    <w:p/>
+    <w:p>
+      <w:r>
+        <w:t>DDMResult interface: gordonGrowth, twoStage, hModel (each number|null), applicable boolean, message string.</w:t>
+      </w:r>
+    </w:p>
+    <w:p>
+      <w:pPr>
+        <w:pStyle w:val="Heading1"/>
+      </w:pPr>
+      <w:r>
+        <w:t>Appendix C: EAS / IFRS Compliance Module</w:t>
+      </w:r>
+    </w:p>
+    <w:p>
+      <w:r>
+        <w:t>File: src/utils/easModules.ts</w:t>
+      </w:r>
+    </w:p>
+    <w:p>
+      <w:r>
+        <w:t>Four Egyptian Accounting Standards compliance modules with IFRS equivalents. Each function is pure, taking inputs and returning structured results.</w:t>
+      </w:r>
+    </w:p>
+    <w:p>
+      <w:pPr>
+        <w:pStyle w:val="Heading2"/>
+      </w:pPr>
+      <w:r>
+        <w:t>C.1 EAS 48 (IFRS 16) - Lease Adjustments</w:t>
+      </w:r>
+    </w:p>
+    <w:p>
+      <w:r>
+        <w:t>Function: calculateLeaseAdjustment(inputs, currentEBITDA, currentTotalDebt)</w:t>
+      </w:r>
+    </w:p>
+    <w:p>
+      <w:pPr>
+        <w:pStyle w:val="ListBullet"/>
+      </w:pPr>
+      <w:r>
+        <w:t>Capitalizes operating leases onto the balance sheet as Right-of-Use (ROU) assets</w:t>
+      </w:r>
+    </w:p>
+    <w:p>
+      <w:pPr>
+        <w:pStyle w:val="ListBullet"/>
+      </w:pPr>
+      <w:r>
+        <w:t>ROU Asset = PV of remaining lease payments at Incremental Borrowing Rate (IBR)</w:t>
+      </w:r>
+    </w:p>
+    <w:p>
+      <w:pPr>
+        <w:pStyle w:val="ListBullet"/>
+      </w:pPr>
+      <w:r>
+        <w:t>Formula: PV = PMT x [(1 - (1+r)^-n) / r]</w:t>
+      </w:r>
+    </w:p>
+    <w:p>
+      <w:pPr>
+        <w:pStyle w:val="ListBullet"/>
+      </w:pPr>
+      <w:r>
+        <w:t>EBITDA add-back = full annual lease payment (reclassified from operating to financing)</w:t>
+      </w:r>
+    </w:p>
+    <w:p>
+      <w:pPr>
+        <w:pStyle w:val="ListBullet"/>
+      </w:pPr>
+      <w:r>
+        <w:t>Debt increase = lease liability (equal to ROU asset value at inception)</w:t>
+      </w:r>
+    </w:p>
+    <w:p>
+      <w:pPr>
+        <w:pStyle w:val="ListBullet"/>
+      </w:pPr>
+      <w:r>
+        <w:t>Depreciation = ROU / remaining term (straight-line)</w:t>
+      </w:r>
+    </w:p>
+    <w:p>
+      <w:pPr>
+        <w:pStyle w:val="ListBullet"/>
+      </w:pPr>
+      <w:r>
+        <w:t>Interest expense = lease liability x IBR (Year 1)</w:t>
+      </w:r>
+    </w:p>
+    <w:p>
+      <w:pPr>
+        <w:pStyle w:val="Heading2"/>
+      </w:pPr>
+      <w:r>
+        <w:t>C.2 EAS 31 (IAS 1) - Normalized Earnings</w:t>
+      </w:r>
+    </w:p>
+    <w:p>
+      <w:r>
+        <w:t>Function: calculateNormalizedEarnings(items, reportedNI, taxRate, shares)</w:t>
+      </w:r>
+    </w:p>
+    <w:p>
+      <w:pPr>
+        <w:pStyle w:val="ListBullet"/>
+      </w:pPr>
+      <w:r>
+        <w:t>Adds back / deducts non-recurring items from reported Net Income</w:t>
+      </w:r>
+    </w:p>
+    <w:p>
+      <w:pPr>
+        <w:pStyle w:val="ListBullet"/>
+      </w:pPr>
+      <w:r>
+        <w:t>Tax-affected items are adjusted at the marginal tax rate</w:t>
+      </w:r>
+    </w:p>
+    <w:p>
+      <w:pPr>
+        <w:pStyle w:val="ListBullet"/>
+      </w:pPr>
+      <w:r>
+        <w:t>Common add-backs: impairment charges, restructuring costs, legal settlements</w:t>
+      </w:r>
+    </w:p>
+    <w:p>
+      <w:pPr>
+        <w:pStyle w:val="ListBullet"/>
+      </w:pPr>
+      <w:r>
+        <w:t>Common deductions: gain on asset sale, insurance proceeds, one-time subsidies</w:t>
+      </w:r>
+    </w:p>
+    <w:p>
+      <w:pPr>
+        <w:pStyle w:val="ListBullet"/>
+      </w:pPr>
+      <w:r>
+        <w:t>Returns: grossAdjustment, taxEffect, netAdjustment, normalizedNI, normalizedEPS</w:t>
+      </w:r>
+    </w:p>
+    <w:p>
+      <w:pPr>
+        <w:pStyle w:val="Heading2"/>
+      </w:pPr>
+      <w:r>
+        <w:t>C.3 EAS 12 (IAS 12) - Deferred Tax in EV Bridge</w:t>
+      </w:r>
+    </w:p>
+    <w:p>
+      <w:r>
+        <w:t>Function: calculateDeferredTaxAdjustment(inputs, baseEquityValue)</w:t>
+      </w:r>
+    </w:p>
+    <w:p>
+      <w:pPr>
+        <w:pStyle w:val="ListBullet"/>
+      </w:pPr>
+      <w:r>
+        <w:t>Net DTA (DTA &gt; DTL) adds to equity value (future tax savings)</w:t>
+      </w:r>
+    </w:p>
+    <w:p>
+      <w:pPr>
+        <w:pStyle w:val="ListBullet"/>
+      </w:pPr>
+      <w:r>
+        <w:t>Net DTL (DTL &gt; DTA) reduces equity value (future tax obligations)</w:t>
+      </w:r>
+    </w:p>
+    <w:p>
+      <w:pPr>
+        <w:pStyle w:val="ListBullet"/>
+      </w:pPr>
+      <w:r>
+        <w:t>Adjusted Equity = Base Equity Value + Net DTA</w:t>
+      </w:r>
+    </w:p>
+    <w:p>
+      <w:pPr>
+        <w:pStyle w:val="Heading2"/>
+      </w:pPr>
+      <w:r>
+        <w:t>C.4 EAS 23 (IAS 33) - Basic &amp; Diluted EPS</w:t>
+      </w:r>
+    </w:p>
+    <w:p>
+      <w:r>
+        <w:t>Function: calculateEPS(netIncome, basicShares, dilutedShares, convertibleInterest)</w:t>
+      </w:r>
+    </w:p>
+    <w:p>
+      <w:pPr>
+        <w:pStyle w:val="ListBullet"/>
+      </w:pPr>
+      <w:r>
+        <w:t>Basic EPS = Net Income / Weighted Average Basic Shares</w:t>
+      </w:r>
+    </w:p>
+    <w:p>
+      <w:pPr>
+        <w:pStyle w:val="ListBullet"/>
+      </w:pPr>
+      <w:r>
+        <w:t>Diluted EPS = (NI + Convertible Interest) / (Basic + Dilutive Shares)</w:t>
+      </w:r>
+    </w:p>
+    <w:p>
+      <w:pPr>
+        <w:pStyle w:val="ListBullet"/>
+      </w:pPr>
+      <w:r>
+        <w:t>Anti-dilution check: if Diluted EPS &gt; Basic EPS, dilutive securities are excluded</w:t>
+      </w:r>
+    </w:p>
+    <w:p>
+      <w:pPr>
+        <w:pStyle w:val="ListBullet"/>
+      </w:pPr>
+      <w:r>
+        <w:t>Returns: basicEPS, dilutedEPS, dilutionPercent, isAntiDilutive flag</w:t>
+      </w:r>
+    </w:p>
+    <w:p>
+      <w:pPr>
+        <w:pStyle w:val="Heading1"/>
+      </w:pPr>
+      <w:r>
+        <w:t>Appendix D: Model Confidence Score (0-100)</w:t>
+      </w:r>
+    </w:p>
+    <w:p>
+      <w:r>
+        <w:t>File: src/utils/confidenceScore.ts - calculateConfidenceScore()</w:t>
+      </w:r>
+    </w:p>
+    <w:p>
+      <w:r>
+        <w:t>Three-pillar scoring system that evaluates the reliability of the valuation model. Total score maps to letter grade: A (85+), B (70+), C (55+), D (40+), F (&lt;40).</w:t>
+      </w:r>
+    </w:p>
+    <w:tbl>
+      <w:tblPr>
+        <w:tblStyle w:val="LightGrid-Accent1"/>
+        <w:tblW w:type="auto" w:w="0"/>
+        <w:jc w:val="center"/>
+        <w:tblLook w:firstColumn="1" w:firstRow="1" w:lastColumn="0" w:lastRow="0" w:noHBand="0" w:noVBand="1" w:val="04A0"/>
+      </w:tblPr>
+      <w:tblGrid>
+        <w:gridCol w:w="2880"/>
+        <w:gridCol w:w="2880"/>
+        <w:gridCol w:w="2880"/>
+      </w:tblGrid>
+      <w:tr>
+        <w:tc>
+          <w:tcPr>
+            <w:tcW w:type="dxa" w:w="2880"/>
+          </w:tcPr>
+          <w:p>
+            <w:r>
+              <w:rPr>
+                <w:b/>
+                <w:sz w:val="18"/>
+              </w:rPr>
+              <w:t>Pillar</w:t>
+            </w:r>
+          </w:p>
+        </w:tc>
+        <w:tc>
+          <w:tcPr>
+            <w:tcW w:type="dxa" w:w="2880"/>
+          </w:tcPr>
+          <w:p>
+            <w:r>
+              <w:rPr>
+                <w:b/>
+                <w:sz w:val="18"/>
+              </w:rPr>
+              <w:t>Max Points</w:t>
+            </w:r>
+          </w:p>
+        </w:tc>
+        <w:tc>
+          <w:tcPr>
+            <w:tcW w:type="dxa" w:w="2880"/>
+          </w:tcPr>
+          <w:p>
+            <w:r>
+              <w:rPr>
+                <w:b/>
+                <w:sz w:val="18"/>
+              </w:rPr>
+              <w:t>Checks</w:t>
+            </w:r>
+          </w:p>
+        </w:tc>
+      </w:tr>
+      <w:tr>
+        <w:tc>
+          <w:tcPr>
+            <w:tcW w:type="dxa" w:w="2880"/>
+          </w:tcPr>
+          <w:p>
+            <w:r>
+              <w:rPr>
+                <w:sz w:val="18"/>
+              </w:rPr>
+              <w:t>Data Quality</w:t>
+            </w:r>
+          </w:p>
+        </w:tc>
+        <w:tc>
+          <w:tcPr>
+            <w:tcW w:type="dxa" w:w="2880"/>
+          </w:tcPr>
+          <w:p>
+            <w:r>
+              <w:rPr>
+                <w:sz w:val="18"/>
+              </w:rPr>
+              <w:t>30 pts</w:t>
+            </w:r>
+          </w:p>
+        </w:tc>
+        <w:tc>
+          <w:tcPr>
+            <w:tcW w:type="dxa" w:w="2880"/>
+          </w:tcPr>
+          <w:p>
+            <w:r>
+              <w:rPr>
+                <w:sz w:val="18"/>
+              </w:rPr>
+              <w:t>D&amp;A&gt;0 (5), CapEx&gt;0 (5), Interest consistency (5), EBITDA&gt;0 (5), Revenue&gt;0 (5), Shares&gt;0 (5)</w:t>
+            </w:r>
+          </w:p>
+        </w:tc>
+      </w:tr>
+      <w:tr>
+        <w:tc>
+          <w:tcPr>
+            <w:tcW w:type="dxa" w:w="2880"/>
+          </w:tcPr>
+          <w:p>
+            <w:r>
+              <w:rPr>
+                <w:sz w:val="18"/>
+              </w:rPr>
+              <w:t>Assumption Reasonableness</w:t>
+            </w:r>
+          </w:p>
+        </w:tc>
+        <w:tc>
+          <w:tcPr>
+            <w:tcW w:type="dxa" w:w="2880"/>
+          </w:tcPr>
+          <w:p>
+            <w:r>
+              <w:rPr>
+                <w:sz w:val="18"/>
+              </w:rPr>
+              <w:t>40 pts</w:t>
+            </w:r>
+          </w:p>
+        </w:tc>
+        <w:tc>
+          <w:tcPr>
+            <w:tcW w:type="dxa" w:w="2880"/>
+          </w:tcPr>
+          <w:p>
+            <w:r>
+              <w:rPr>
+                <w:sz w:val="18"/>
+              </w:rPr>
+              <w:t>Rev growth&lt;=25% (8), EBITDA margin&lt;=50% (8), Terminal g&lt;GDP (8), WACC 15-35% (8), FCFF reconciles (8)</w:t>
+            </w:r>
+          </w:p>
+        </w:tc>
+      </w:tr>
+      <w:tr>
+        <w:tc>
+          <w:tcPr>
+            <w:tcW w:type="dxa" w:w="2880"/>
+          </w:tcPr>
+          <w:p>
+            <w:r>
+              <w:rPr>
+                <w:sz w:val="18"/>
+              </w:rPr>
+              <w:t>Model Robustness</w:t>
+            </w:r>
+          </w:p>
+        </w:tc>
+        <w:tc>
+          <w:tcPr>
+            <w:tcW w:type="dxa" w:w="2880"/>
+          </w:tcPr>
+          <w:p>
+            <w:r>
+              <w:rPr>
+                <w:sz w:val="18"/>
+              </w:rPr>
+              <w:t>30 pts</w:t>
+            </w:r>
+          </w:p>
+        </w:tc>
+        <w:tc>
+          <w:tcPr>
+            <w:tcW w:type="dxa" w:w="2880"/>
+          </w:tcPr>
+          <w:p>
+            <w:r>
+              <w:rPr>
+                <w:sz w:val="18"/>
+              </w:rPr>
+              <w:t>TV&lt;80% of EV (10), Value within +/-50% of market (10), DCF/DDM agreement (5), Interest coverage&gt;1.5x (5)</w:t>
+            </w:r>
+          </w:p>
+        </w:tc>
+      </w:tr>
+    </w:tbl>
+    <w:p/>
+    <w:p>
+      <w:r>
+        <w:t>Returns: totalScore, grade (A-F), per-pillar scores, detailed breakdown array with per-check scores, and a narrative explanation of concerns.</w:t>
+      </w:r>
+    </w:p>
+    <w:p>
+      <w:pPr>
+        <w:pStyle w:val="Heading1"/>
+      </w:pPr>
+      <w:r>
+        <w:t>Appendix E: Input Validation Engine</w:t>
+      </w:r>
+    </w:p>
+    <w:p>
+      <w:r>
+        <w:t>File: src/utils/inputValidation.ts - validateInputs()</w:t>
+      </w:r>
+    </w:p>
+    <w:p>
+      <w:r>
+        <w:t>Three severity levels with distinct behavior:</w:t>
+      </w:r>
+    </w:p>
+    <w:p>
+      <w:pPr>
+        <w:pStyle w:val="Heading2"/>
+      </w:pPr>
+      <w:r>
+        <w:t>Hard Blocks (Must Fix)</w:t>
+      </w:r>
+    </w:p>
+    <w:p>
+      <w:pPr>
+        <w:pStyle w:val="ListBullet"/>
+      </w:pPr>
+      <w:r>
+        <w:t>Revenue &lt;= 0: Cannot perform valuation without revenue</w:t>
+      </w:r>
+    </w:p>
+    <w:p>
+      <w:pPr>
+        <w:pStyle w:val="ListBullet"/>
+      </w:pPr>
+      <w:r>
+        <w:t>Shares Outstanding &lt;= 0: Cannot calculate per-share values</w:t>
+      </w:r>
+    </w:p>
+    <w:p>
+      <w:pPr>
+        <w:pStyle w:val="ListBullet"/>
+      </w:pPr>
+      <w:r>
+        <w:t>WACC &lt;= Terminal Growth: Gordon Growth Model produces infinite/negative TV</w:t>
+      </w:r>
+    </w:p>
+    <w:p>
+      <w:pPr>
+        <w:pStyle w:val="ListBullet"/>
+      </w:pPr>
+      <w:r>
+        <w:t>WACC &lt;= 0: Invalid discount rate</w:t>
+      </w:r>
+    </w:p>
+    <w:p>
+      <w:pPr>
+        <w:pStyle w:val="ListBullet"/>
+      </w:pPr>
+      <w:r>
+        <w:t>Projection Years &lt; 1 or &gt; 20: Out of reasonable range</w:t>
+      </w:r>
+    </w:p>
+    <w:p>
+      <w:pPr>
+        <w:pStyle w:val="ListBullet"/>
+      </w:pPr>
+      <w:r>
+        <w:t>Stock Price &lt;= 0: Cannot calculate upside/downside</w:t>
+      </w:r>
+    </w:p>
+    <w:p>
+      <w:pPr>
+        <w:pStyle w:val="ListBullet"/>
+      </w:pPr>
+      <w:r>
+        <w:t>EBITDA Margin &lt;= 0% or &gt; 95%: Unrealistic operating profile</w:t>
+      </w:r>
+    </w:p>
+    <w:p>
+      <w:pPr>
+        <w:pStyle w:val="ListBullet"/>
+      </w:pPr>
+      <w:r>
+        <w:t>Revenue Growth &gt; 100%: Unreasonably aggressive</w:t>
+      </w:r>
+    </w:p>
+    <w:p>
+      <w:pPr>
+        <w:pStyle w:val="ListBullet"/>
+      </w:pPr>
+      <w:r>
+        <w:t>Tax Rate &lt; 0% or &gt; 60%: Out of legal range</w:t>
+      </w:r>
+    </w:p>
+    <w:p>
+      <w:pPr>
+        <w:pStyle w:val="Heading2"/>
+      </w:pPr>
+      <w:r>
+        <w:t>Soft Warnings (Review Recommended)</w:t>
+      </w:r>
+    </w:p>
+    <w:p>
+      <w:pPr>
+        <w:pStyle w:val="ListBullet"/>
+      </w:pPr>
+      <w:r>
+        <w:t>Terminal Value &gt; 80% of EV: Model relies too heavily on terminal assumptions</w:t>
+      </w:r>
+    </w:p>
+    <w:p>
+      <w:pPr>
+        <w:pStyle w:val="ListBullet"/>
+      </w:pPr>
+      <w:r>
+        <w:t>Implied price deviates &gt; 50% from market: May indicate aggressive assumptions</w:t>
+      </w:r>
+    </w:p>
+    <w:p>
+      <w:pPr>
+        <w:pStyle w:val="ListBullet"/>
+      </w:pPr>
+      <w:r>
+        <w:t>Negative FCF in base year: DCF may extrapolate losses</w:t>
+      </w:r>
+    </w:p>
+    <w:p>
+      <w:pPr>
+        <w:pStyle w:val="ListBullet"/>
+      </w:pPr>
+      <w:r>
+        <w:t>Interest Coverage &lt; 1.5x: Company may face debt service issues</w:t>
+      </w:r>
+    </w:p>
+    <w:p>
+      <w:pPr>
+        <w:pStyle w:val="ListBullet"/>
+      </w:pPr>
+      <w:r>
+        <w:t>D&amp;A = 0 with positive PP&amp;E: May understate reinvestment needs</w:t>
+      </w:r>
+    </w:p>
+    <w:p>
+      <w:pPr>
+        <w:pStyle w:val="ListBullet"/>
+      </w:pPr>
+      <w:r>
+        <w:t>CapEx = 0: FCFF may be overstated</w:t>
+      </w:r>
+    </w:p>
+    <w:p>
+      <w:pPr>
+        <w:pStyle w:val="ListBullet"/>
+      </w:pPr>
+      <w:r>
+        <w:t>Revenue growth &gt; 25%: Aggressive for most companies</w:t>
+      </w:r>
+    </w:p>
+    <w:p>
+      <w:pPr>
+        <w:pStyle w:val="ListBullet"/>
+      </w:pPr>
+      <w:r>
+        <w:t>Debt/Equity &gt; 3.0: Highly leveraged</w:t>
+      </w:r>
+    </w:p>
+    <w:p>
+      <w:pPr>
+        <w:pStyle w:val="Heading2"/>
+      </w:pPr>
+      <w:r>
+        <w:t>Edge Case Auto-Adjustments</w:t>
+      </w:r>
+    </w:p>
+    <w:p>
+      <w:pPr>
+        <w:pStyle w:val="ListBullet"/>
+      </w:pPr>
+      <w:r>
+        <w:t>Zero interest expense with positive debt: Impute at ~2.8% of total debt</w:t>
+      </w:r>
+    </w:p>
+    <w:p>
+      <w:pPr>
+        <w:pStyle w:val="ListBullet"/>
+      </w:pPr>
+      <w:r>
+        <w:t>COGS = 0 for banks: Recalculate as Revenue - Interest Expense</w:t>
+      </w:r>
+    </w:p>
+    <w:p>
+      <w:pPr>
+        <w:pStyle w:val="ListBullet"/>
+      </w:pPr>
+      <w:r>
+        <w:t>Negative equity: Flag but allow calculation to proceed</w:t>
+      </w:r>
+    </w:p>
+    <w:p>
+      <w:pPr>
+        <w:pStyle w:val="ListBullet"/>
+      </w:pPr>
+      <w:r>
+        <w:t>Missing D&amp;A: Default to 0 with warning</w:t>
+      </w:r>
+    </w:p>
+    <w:p>
+      <w:pPr>
+        <w:pStyle w:val="Heading1"/>
+      </w:pPr>
+      <w:r>
+        <w:t>Appendix F: JSON Export (CFA-Grade)</w:t>
+      </w:r>
+    </w:p>
+    <w:p>
+      <w:r>
+        <w:t>File: src/utils/jsonExport.ts</w:t>
+      </w:r>
+    </w:p>
+    <w:p>
+      <w:r>
+        <w:t>Generates a fully-compliant JSON export with complete metadata and audit trail. Engine version: 4.0.0. Schema follows Section 8.4 specification.</w:t>
+      </w:r>
+    </w:p>
+    <w:p>
+      <w:r>
+        <w:t>The JSON structure contains three top-level sections:</w:t>
+      </w:r>
+    </w:p>
+    <w:tbl>
+      <w:tblPr>
+        <w:tblStyle w:val="LightGrid-Accent1"/>
+        <w:tblW w:type="auto" w:w="0"/>
+        <w:jc w:val="center"/>
+        <w:tblLook w:firstColumn="1" w:firstRow="1" w:lastColumn="0" w:lastRow="0" w:noHBand="0" w:noVBand="1" w:val="04A0"/>
+      </w:tblPr>
+      <w:tblGrid>
+        <w:gridCol w:w="4320"/>
+        <w:gridCol w:w="4320"/>
+      </w:tblGrid>
+      <w:tr>
+        <w:tc>
+          <w:tcPr>
+            <w:tcW w:type="dxa" w:w="4320"/>
+          </w:tcPr>
+          <w:p>
+            <w:r>
+              <w:rPr>
+                <w:b/>
+                <w:sz w:val="18"/>
+              </w:rPr>
+              <w:t>Section</w:t>
+            </w:r>
+          </w:p>
+        </w:tc>
+        <w:tc>
+          <w:tcPr>
+            <w:tcW w:type="dxa" w:w="4320"/>
+          </w:tcPr>
+          <w:p>
+            <w:r>
+              <w:rPr>
+                <w:b/>
+                <w:sz w:val="18"/>
+              </w:rPr>
+              <w:t>Contents</w:t>
+            </w:r>
+          </w:p>
+        </w:tc>
+      </w:tr>
+      <w:tr>
+        <w:tc>
+          <w:tcPr>
+            <w:tcW w:type="dxa" w:w="4320"/>
+          </w:tcPr>
+          <w:p>
+            <w:r>
+              <w:rPr>
+                <w:sz w:val="18"/>
+              </w:rPr>
+              <w:t>metadata</w:t>
+            </w:r>
+          </w:p>
+        </w:tc>
+        <w:tc>
+          <w:tcPr>
+            <w:tcW w:type="dxa" w:w="4320"/>
+          </w:tcPr>
+          <w:p>
+            <w:r>
+              <w:rPr>
+                <w:sz w:val="18"/>
+              </w:rPr>
+              <w:t>engine_version, generation_date, currency, company_name, capm_method, rf_instrument, rf_date, discounting_convention, accounting_standard</w:t>
+            </w:r>
+          </w:p>
+        </w:tc>
+      </w:tr>
+      <w:tr>
+        <w:tc>
+          <w:tcPr>
+            <w:tcW w:type="dxa" w:w="4320"/>
+          </w:tcPr>
+          <w:p>
+            <w:r>
+              <w:rPr>
+                <w:sz w:val="18"/>
+              </w:rPr>
+              <w:t>inputs</w:t>
+            </w:r>
+          </w:p>
+        </w:tc>
+        <w:tc>
+          <w:tcPr>
+            <w:tcW w:type="dxa" w:w="4320"/>
+          </w:tcPr>
+          <w:p>
+            <w:r>
+              <w:rPr>
+                <w:sz w:val="18"/>
+              </w:rPr>
+              <w:t>All financial data fields, all assumption parameters (25+ fields)</w:t>
+            </w:r>
+          </w:p>
+        </w:tc>
+      </w:tr>
+      <w:tr>
+        <w:tc>
+          <w:tcPr>
+            <w:tcW w:type="dxa" w:w="4320"/>
+          </w:tcPr>
+          <w:p>
+            <w:r>
+              <w:rPr>
+                <w:sz w:val="18"/>
+              </w:rPr>
+              <w:t>calculated</w:t>
+            </w:r>
+          </w:p>
+        </w:tc>
+        <w:tc>
+          <w:tcPr>
+            <w:tcW w:type="dxa" w:w="4320"/>
+          </w:tcPr>
+          <w:p>
+            <w:r>
+              <w:rPr>
+                <w:sz w:val="18"/>
+              </w:rPr>
+              <w:t>WACC result, DCF result with full projections and EV bridge, DDM result, comparable multiples, sensitivity matrix, financial ratios, FCFF verification, scenario analysis</w:t>
+            </w:r>
+          </w:p>
+        </w:tc>
+      </w:tr>
+    </w:tbl>
+    <w:p/>
+    <w:p>
+      <w:pPr>
+        <w:pStyle w:val="Heading1"/>
+      </w:pPr>
+      <w:r>
+        <w:t>Appendix G: Updated Valuation Section Components</w:t>
+      </w:r>
+    </w:p>
+    <w:p>
+      <w:r>
+        <w:t>File: src/components/valuation/sections/ (14 components)</w:t>
+      </w:r>
+    </w:p>
+    <w:tbl>
+      <w:tblPr>
+        <w:tblStyle w:val="LightGrid-Accent1"/>
+        <w:tblW w:type="auto" w:w="0"/>
+        <w:jc w:val="center"/>
+        <w:tblLook w:firstColumn="1" w:firstRow="1" w:lastColumn="0" w:lastRow="0" w:noHBand="0" w:noVBand="1" w:val="04A0"/>
+      </w:tblPr>
+      <w:tblGrid>
+        <w:gridCol w:w="4320"/>
+        <w:gridCol w:w="4320"/>
+      </w:tblGrid>
+      <w:tr>
+        <w:tc>
+          <w:tcPr>
+            <w:tcW w:type="dxa" w:w="4320"/>
+          </w:tcPr>
+          <w:p>
+            <w:r>
+              <w:rPr>
+                <w:b/>
+                <w:sz w:val="18"/>
+              </w:rPr>
+              <w:t>Component</w:t>
+            </w:r>
+          </w:p>
+        </w:tc>
+        <w:tc>
+          <w:tcPr>
+            <w:tcW w:type="dxa" w:w="4320"/>
+          </w:tcPr>
+          <w:p>
+            <w:r>
+              <w:rPr>
+                <w:b/>
+                <w:sz w:val="18"/>
+              </w:rPr>
+              <w:t>Purpose</w:t>
+            </w:r>
+          </w:p>
+        </w:tc>
+      </w:tr>
+      <w:tr>
+        <w:tc>
+          <w:tcPr>
+            <w:tcW w:type="dxa" w:w="4320"/>
+          </w:tcPr>
+          <w:p>
+            <w:r>
+              <w:rPr>
+                <w:sz w:val="18"/>
+              </w:rPr>
+              <w:t>ValidationAlerts.tsx</w:t>
+            </w:r>
+          </w:p>
+        </w:tc>
+        <w:tc>
+          <w:tcPr>
+            <w:tcW w:type="dxa" w:w="4320"/>
+          </w:tcPr>
+          <w:p>
+            <w:r>
+              <w:rPr>
+                <w:sz w:val="18"/>
+              </w:rPr>
+              <w:t>Market-specific validation warnings with severity levels</w:t>
+            </w:r>
+          </w:p>
+        </w:tc>
+      </w:tr>
+      <w:tr>
+        <w:tc>
+          <w:tcPr>
+            <w:tcW w:type="dxa" w:w="4320"/>
+          </w:tcPr>
+          <w:p>
+            <w:r>
+              <w:rPr>
+                <w:sz w:val="18"/>
+              </w:rPr>
+              <w:t>ValuationStyleSelector.tsx</w:t>
+            </w:r>
+          </w:p>
+        </w:tc>
+        <w:tc>
+          <w:tcPr>
+            <w:tcW w:type="dxa" w:w="4320"/>
+          </w:tcPr>
+          <w:p>
+            <w:r>
+              <w:rPr>
+                <w:sz w:val="18"/>
+              </w:rPr>
+              <w:t>Conservative/Moderate/Aggressive with side-by-side DCF comparison</w:t>
+            </w:r>
+          </w:p>
+        </w:tc>
+      </w:tr>
+      <w:tr>
+        <w:tc>
+          <w:tcPr>
+            <w:tcW w:type="dxa" w:w="4320"/>
+          </w:tcPr>
+          <w:p>
+            <w:r>
+              <w:rPr>
+                <w:sz w:val="18"/>
+              </w:rPr>
+              <w:t>MarketVsFundamental.tsx</w:t>
+            </w:r>
+          </w:p>
+        </w:tc>
+        <w:tc>
+          <w:tcPr>
+            <w:tcW w:type="dxa" w:w="4320"/>
+          </w:tcPr>
+          <w:p>
+            <w:r>
+              <w:rPr>
+                <w:sz w:val="18"/>
+              </w:rPr>
+              <w:t>Market price vs intrinsic value with key statistics</w:t>
+            </w:r>
+          </w:p>
+        </w:tc>
+      </w:tr>
+      <w:tr>
+        <w:tc>
+          <w:tcPr>
+            <w:tcW w:type="dxa" w:w="4320"/>
+          </w:tcPr>
+          <w:p>
+            <w:r>
+              <w:rPr>
+                <w:sz w:val="18"/>
+              </w:rPr>
+              <w:t>ScenarioAnalysis.tsx</w:t>
+            </w:r>
+          </w:p>
+        </w:tc>
+        <w:tc>
+          <w:tcPr>
+            <w:tcW w:type="dxa" w:w="4320"/>
+          </w:tcPr>
+          <w:p>
+            <w:r>
+              <w:rPr>
+                <w:sz w:val="18"/>
+              </w:rPr>
+              <w:t>Bear/Base/Bull with sensitivity matrix and Monte Carlo</w:t>
+            </w:r>
+          </w:p>
+        </w:tc>
+      </w:tr>
+      <w:tr>
+        <w:tc>
+          <w:tcPr>
+            <w:tcW w:type="dxa" w:w="4320"/>
+          </w:tcPr>
+          <w:p>
+            <w:r>
+              <w:rPr>
+                <w:sz w:val="18"/>
+              </w:rPr>
+              <w:t>ValuationSummaryCards.tsx</w:t>
+            </w:r>
+          </w:p>
+        </w:tc>
+        <w:tc>
+          <w:tcPr>
+            <w:tcW w:type="dxa" w:w="4320"/>
+          </w:tcPr>
+          <w:p>
+            <w:r>
+              <w:rPr>
+                <w:sz w:val="18"/>
+              </w:rPr>
+              <w:t>DCF, DDM, Comps, and Blended value cards</w:t>
+            </w:r>
+          </w:p>
+        </w:tc>
+      </w:tr>
+      <w:tr>
+        <w:tc>
+          <w:tcPr>
+            <w:tcW w:type="dxa" w:w="4320"/>
+          </w:tcPr>
+          <w:p>
+            <w:r>
+              <w:rPr>
+                <w:sz w:val="18"/>
+              </w:rPr>
+              <w:t>BlendedWeightSlider.tsx</w:t>
+            </w:r>
+          </w:p>
+        </w:tc>
+        <w:tc>
+          <w:tcPr>
+            <w:tcW w:type="dxa" w:w="4320"/>
+          </w:tcPr>
+          <w:p>
+            <w:r>
+              <w:rPr>
+                <w:sz w:val="18"/>
+              </w:rPr>
+              <w:t>Adjustable DCF/Comps weighting with live preview</w:t>
+            </w:r>
+          </w:p>
+        </w:tc>
+      </w:tr>
+      <w:tr>
+        <w:tc>
+          <w:tcPr>
+            <w:tcW w:type="dxa" w:w="4320"/>
+          </w:tcPr>
+          <w:p>
+            <w:r>
+              <w:rPr>
+                <w:sz w:val="18"/>
+              </w:rPr>
+              <w:t>ComparableBreakdown.tsx</w:t>
+            </w:r>
+          </w:p>
+        </w:tc>
+        <w:tc>
+          <w:tcPr>
+            <w:tcW w:type="dxa" w:w="4320"/>
+          </w:tcPr>
+          <w:p>
+            <w:r>
+              <w:rPr>
+                <w:sz w:val="18"/>
+              </w:rPr>
+              <w:t>Individual method implied prices (P/E, EV/EBITDA, P/S, P/B)</w:t>
+            </w:r>
+          </w:p>
+        </w:tc>
+      </w:tr>
+      <w:tr>
+        <w:tc>
+          <w:tcPr>
+            <w:tcW w:type="dxa" w:w="4320"/>
+          </w:tcPr>
+          <w:p>
+            <w:r>
+              <w:rPr>
+                <w:sz w:val="18"/>
+              </w:rPr>
+              <w:t>BaseYearFCF.tsx</w:t>
+            </w:r>
+          </w:p>
+        </w:tc>
+        <w:tc>
+          <w:tcPr>
+            <w:tcW w:type="dxa" w:w="4320"/>
+          </w:tcPr>
+          <w:p>
+            <w:r>
+              <w:rPr>
+                <w:sz w:val="18"/>
+              </w:rPr>
+              <w:t>Base year free cash flow breakdown</w:t>
+            </w:r>
+          </w:p>
+        </w:tc>
+      </w:tr>
+      <w:tr>
+        <w:tc>
+          <w:tcPr>
+            <w:tcW w:type="dxa" w:w="4320"/>
+          </w:tcPr>
+          <w:p>
+            <w:r>
+              <w:rPr>
+                <w:sz w:val="18"/>
+              </w:rPr>
+              <w:t>DCFProjectionsTable.tsx</w:t>
+            </w:r>
+          </w:p>
+        </w:tc>
+        <w:tc>
+          <w:tcPr>
+            <w:tcW w:type="dxa" w:w="4320"/>
+          </w:tcPr>
+          <w:p>
+            <w:r>
+              <w:rPr>
+                <w:sz w:val="18"/>
+              </w:rPr>
+              <w:t>Year-by-year revenue, EBITDA, D&amp;A, EBIT, NOPAT, CapEx, WC, FCFF</w:t>
+            </w:r>
+          </w:p>
+        </w:tc>
+      </w:tr>
+      <w:tr>
+        <w:tc>
+          <w:tcPr>
+            <w:tcW w:type="dxa" w:w="4320"/>
+          </w:tcPr>
+          <w:p>
+            <w:r>
+              <w:rPr>
+                <w:sz w:val="18"/>
+              </w:rPr>
+              <w:t>KeyMetricsGrid.tsx</w:t>
+            </w:r>
+          </w:p>
+        </w:tc>
+        <w:tc>
+          <w:tcPr>
+            <w:tcW w:type="dxa" w:w="4320"/>
+          </w:tcPr>
+          <w:p>
+            <w:r>
+              <w:rPr>
+                <w:sz w:val="18"/>
+              </w:rPr>
+              <w:t>30+ financial ratios in card format</w:t>
+            </w:r>
+          </w:p>
+        </w:tc>
+      </w:tr>
+      <w:tr>
+        <w:tc>
+          <w:tcPr>
+            <w:tcW w:type="dxa" w:w="4320"/>
+          </w:tcPr>
+          <w:p>
+            <w:r>
+              <w:rPr>
+                <w:sz w:val="18"/>
+              </w:rPr>
+              <w:t>ReverseDCFSection.tsx</w:t>
+            </w:r>
+          </w:p>
+        </w:tc>
+        <w:tc>
+          <w:tcPr>
+            <w:tcW w:type="dxa" w:w="4320"/>
+          </w:tcPr>
+          <w:p>
+            <w:r>
+              <w:rPr>
+                <w:sz w:val="18"/>
+              </w:rPr>
+              <w:t>Market-implied growth rate analysis</w:t>
+            </w:r>
+          </w:p>
+        </w:tc>
+      </w:tr>
+      <w:tr>
+        <w:tc>
+          <w:tcPr>
+            <w:tcW w:type="dxa" w:w="4320"/>
+          </w:tcPr>
+          <w:p>
+            <w:r>
+              <w:rPr>
+                <w:sz w:val="18"/>
+              </w:rPr>
+              <w:t>QualityScorecard.tsx</w:t>
+            </w:r>
+          </w:p>
+        </w:tc>
+        <w:tc>
+          <w:tcPr>
+            <w:tcW w:type="dxa" w:w="4320"/>
+          </w:tcPr>
+          <w:p>
+            <w:r>
+              <w:rPr>
+                <w:sz w:val="18"/>
+              </w:rPr>
+              <w:t>4-category quality assessment with letter grade</w:t>
+            </w:r>
+          </w:p>
+        </w:tc>
+      </w:tr>
+      <w:tr>
+        <w:tc>
+          <w:tcPr>
+            <w:tcW w:type="dxa" w:w="4320"/>
+          </w:tcPr>
+          <w:p>
+            <w:r>
+              <w:rPr>
+                <w:sz w:val="18"/>
+              </w:rPr>
+              <w:t>FCFFReconciliation.tsx</w:t>
+            </w:r>
+          </w:p>
+        </w:tc>
+        <w:tc>
+          <w:tcPr>
+            <w:tcW w:type="dxa" w:w="4320"/>
+          </w:tcPr>
+          <w:p>
+            <w:r>
+              <w:rPr>
+                <w:sz w:val="18"/>
+              </w:rPr>
+              <w:t>Three-method FCFF cross-verification display</w:t>
+            </w:r>
+          </w:p>
+        </w:tc>
+      </w:tr>
+      <w:tr>
+        <w:tc>
+          <w:tcPr>
+            <w:tcW w:type="dxa" w:w="4320"/>
+          </w:tcPr>
+          <w:p>
+            <w:r>
+              <w:rPr>
+                <w:sz w:val="18"/>
+              </w:rPr>
+              <w:t>EASComplianceSection.tsx</w:t>
+            </w:r>
+          </w:p>
+        </w:tc>
+        <w:tc>
+          <w:tcPr>
+            <w:tcW w:type="dxa" w:w="4320"/>
+          </w:tcPr>
+          <w:p>
+            <w:r>
+              <w:rPr>
+                <w:sz w:val="18"/>
+              </w:rPr>
+              <w:t>EAS 48/31/12/23 compliance panels with calculations</w:t>
+            </w:r>
+          </w:p>
+        </w:tc>
+      </w:tr>
+    </w:tbl>
+    <w:p/>
+    <w:p>
+      <w:r>
+        <w:br w:type="page"/>
+      </w:r>
+    </w:p>
+    <w:p>
+      <w:pPr>
+        <w:pStyle w:val="Heading1"/>
+      </w:pPr>
+      <w:r>
+        <w:t>Appendix A: FCFF Three-Way Cross-Verification</w:t>
+      </w:r>
+    </w:p>
+    <w:p>
+      <w:r>
+        <w:t>File: src/utils/valuationEngine.ts - calculateFCFFVerification()</w:t>
+      </w:r>
+    </w:p>
+    <w:p>
+      <w:r>
+        <w:t>All three methods must produce identical FCFF results within a 1% tolerance. This is a critical audit check that ensures internal consistency of financial data.</w:t>
+      </w:r>
+    </w:p>
+    <w:tbl>
+      <w:tblPr>
+        <w:tblStyle w:val="LightGrid-Accent1"/>
+        <w:tblW w:type="auto" w:w="0"/>
+        <w:jc w:val="center"/>
+        <w:tblLook w:firstColumn="1" w:firstRow="1" w:lastColumn="0" w:lastRow="0" w:noHBand="0" w:noVBand="1" w:val="04A0"/>
+      </w:tblPr>
+      <w:tblGrid>
+        <w:gridCol w:w="2880"/>
+        <w:gridCol w:w="2880"/>
+        <w:gridCol w:w="2880"/>
+      </w:tblGrid>
+      <w:tr>
+        <w:tc>
+          <w:tcPr>
+            <w:tcW w:type="dxa" w:w="2880"/>
+          </w:tcPr>
+          <w:p>
+            <w:r>
+              <w:rPr>
+                <w:b/>
+                <w:sz w:val="18"/>
+              </w:rPr>
+              <w:t>Method</w:t>
+            </w:r>
+          </w:p>
+        </w:tc>
+        <w:tc>
+          <w:tcPr>
+            <w:tcW w:type="dxa" w:w="2880"/>
+          </w:tcPr>
+          <w:p>
+            <w:r>
+              <w:rPr>
+                <w:b/>
+                <w:sz w:val="18"/>
+              </w:rPr>
+              <w:t>Formula</w:t>
+            </w:r>
+          </w:p>
+        </w:tc>
+        <w:tc>
+          <w:tcPr>
+            <w:tcW w:type="dxa" w:w="2880"/>
+          </w:tcPr>
+          <w:p>
+            <w:r>
+              <w:rPr>
+                <w:b/>
+                <w:sz w:val="18"/>
+              </w:rPr>
+              <w:t>Route</w:t>
+            </w:r>
+          </w:p>
+        </w:tc>
+      </w:tr>
+      <w:tr>
+        <w:tc>
+          <w:tcPr>
+            <w:tcW w:type="dxa" w:w="2880"/>
+          </w:tcPr>
+          <w:p>
+            <w:r>
+              <w:rPr>
+                <w:sz w:val="18"/>
+              </w:rPr>
+              <w:t>Method 1 (NOPAT)</w:t>
+            </w:r>
+          </w:p>
+        </w:tc>
+        <w:tc>
+          <w:tcPr>
+            <w:tcW w:type="dxa" w:w="2880"/>
+          </w:tcPr>
+          <w:p>
+            <w:r>
+              <w:rPr>
+                <w:sz w:val="18"/>
+              </w:rPr>
+              <w:t>EBIT x (1-t) + D&amp;A - CapEx - Delta WC</w:t>
+            </w:r>
+          </w:p>
+        </w:tc>
+        <w:tc>
+          <w:tcPr>
+            <w:tcW w:type="dxa" w:w="2880"/>
+          </w:tcPr>
+          <w:p>
+            <w:r>
+              <w:rPr>
+                <w:sz w:val="18"/>
+              </w:rPr>
+              <w:t>Primary</w:t>
+            </w:r>
+          </w:p>
+        </w:tc>
+      </w:tr>
+      <w:tr>
+        <w:tc>
+          <w:tcPr>
+            <w:tcW w:type="dxa" w:w="2880"/>
+          </w:tcPr>
+          <w:p>
+            <w:r>
+              <w:rPr>
+                <w:sz w:val="18"/>
+              </w:rPr>
+              <w:t>Method 2 (EBITDA)</w:t>
+            </w:r>
+          </w:p>
+        </w:tc>
+        <w:tc>
+          <w:tcPr>
+            <w:tcW w:type="dxa" w:w="2880"/>
+          </w:tcPr>
+          <w:p>
+            <w:r>
+              <w:rPr>
+                <w:sz w:val="18"/>
+              </w:rPr>
+              <w:t>EBITDA x (1-t) + D&amp;A x t - CapEx - Delta WC</w:t>
+            </w:r>
+          </w:p>
+        </w:tc>
+        <w:tc>
+          <w:tcPr>
+            <w:tcW w:type="dxa" w:w="2880"/>
+          </w:tcPr>
+          <w:p>
+            <w:r>
+              <w:rPr>
+                <w:sz w:val="18"/>
+              </w:rPr>
+              <w:t>Cross-check</w:t>
+            </w:r>
+          </w:p>
+        </w:tc>
+      </w:tr>
+      <w:tr>
+        <w:tc>
+          <w:tcPr>
+            <w:tcW w:type="dxa" w:w="2880"/>
+          </w:tcPr>
+          <w:p>
+            <w:r>
+              <w:rPr>
+                <w:sz w:val="18"/>
+              </w:rPr>
+              <w:t>Method 3 (Net Income)</w:t>
+            </w:r>
+          </w:p>
+        </w:tc>
+        <w:tc>
+          <w:tcPr>
+            <w:tcW w:type="dxa" w:w="2880"/>
+          </w:tcPr>
+          <w:p>
+            <w:r>
+              <w:rPr>
+                <w:sz w:val="18"/>
+              </w:rPr>
+              <w:t>NI + Interest x (1-t) + D&amp;A - CapEx - Delta WC</w:t>
+            </w:r>
+          </w:p>
+        </w:tc>
+        <w:tc>
+          <w:tcPr>
+            <w:tcW w:type="dxa" w:w="2880"/>
+          </w:tcPr>
+          <w:p>
+            <w:r>
+              <w:rPr>
+                <w:sz w:val="18"/>
+              </w:rPr>
+              <w:t>Cross-check</w:t>
+            </w:r>
+          </w:p>
+        </w:tc>
+      </w:tr>
+    </w:tbl>
+    <w:p/>
+    <w:p>
+      <w:r>
+        <w:t>The FCFFVerification interface returns: method1, method2, method3 values, allMatch boolean, and tolerance percentage. The UI displays a reconciliation table in the FCFFReconciliation.tsx component with color-coded match indicators.</w:t>
+      </w:r>
+    </w:p>
+    <w:p>
+      <w:pPr>
+        <w:pStyle w:val="Heading1"/>
+      </w:pPr>
+      <w:r>
+        <w:t>Appendix B: Dividend Discount Models (DDM)</w:t>
+      </w:r>
+    </w:p>
+    <w:p>
+      <w:r>
+        <w:t>File: src/utils/valuationEngine.ts - calculateDDM()</w:t>
+      </w:r>
+    </w:p>
+    <w:p>
+      <w:r>
+        <w:t>Three DDM variants are implemented. All discount at Cost of Equity (Ke), NOT WACC, since DDM values equity directly. DDM is only applicable when dividendsPerShare &gt; 0.</w:t>
+      </w:r>
+    </w:p>
+    <w:tbl>
+      <w:tblPr>
+        <w:tblStyle w:val="LightGrid-Accent1"/>
+        <w:tblW w:type="auto" w:w="0"/>
+        <w:jc w:val="center"/>
+        <w:tblLook w:firstColumn="1" w:firstRow="1" w:lastColumn="0" w:lastRow="0" w:noHBand="0" w:noVBand="1" w:val="04A0"/>
+      </w:tblPr>
+      <w:tblGrid>
+        <w:gridCol w:w="2880"/>
+        <w:gridCol w:w="2880"/>
+        <w:gridCol w:w="2880"/>
+      </w:tblGrid>
+      <w:tr>
+        <w:tc>
+          <w:tcPr>
+            <w:tcW w:type="dxa" w:w="2880"/>
+          </w:tcPr>
+          <w:p>
+            <w:r>
+              <w:rPr>
+                <w:b/>
+                <w:sz w:val="18"/>
+              </w:rPr>
+              <w:t>Model</w:t>
+            </w:r>
+          </w:p>
+        </w:tc>
+        <w:tc>
+          <w:tcPr>
+            <w:tcW w:type="dxa" w:w="2880"/>
+          </w:tcPr>
+          <w:p>
+            <w:r>
+              <w:rPr>
+                <w:b/>
+                <w:sz w:val="18"/>
+              </w:rPr>
+              <w:t>Formula</w:t>
+            </w:r>
+          </w:p>
+        </w:tc>
+        <w:tc>
+          <w:tcPr>
+            <w:tcW w:type="dxa" w:w="2880"/>
+          </w:tcPr>
+          <w:p>
+            <w:r>
+              <w:rPr>
+                <w:b/>
+                <w:sz w:val="18"/>
+              </w:rPr>
+              <w:t>Use Case</w:t>
+            </w:r>
+          </w:p>
+        </w:tc>
+      </w:tr>
+      <w:tr>
+        <w:tc>
+          <w:tcPr>
+            <w:tcW w:type="dxa" w:w="2880"/>
+          </w:tcPr>
+          <w:p>
+            <w:r>
+              <w:rPr>
+                <w:sz w:val="18"/>
+              </w:rPr>
+              <w:t>Gordon Growth</w:t>
+            </w:r>
+          </w:p>
+        </w:tc>
+        <w:tc>
+          <w:tcPr>
+            <w:tcW w:type="dxa" w:w="2880"/>
+          </w:tcPr>
+          <w:p>
+            <w:r>
+              <w:rPr>
+                <w:sz w:val="18"/>
+              </w:rPr>
+              <w:t>DPS x (1+g) / (Ke - g)</w:t>
+            </w:r>
+          </w:p>
+        </w:tc>
+        <w:tc>
+          <w:tcPr>
+            <w:tcW w:type="dxa" w:w="2880"/>
+          </w:tcPr>
+          <w:p>
+            <w:r>
+              <w:rPr>
+                <w:sz w:val="18"/>
+              </w:rPr>
+              <w:t>Stable dividend growers</w:t>
+            </w:r>
+          </w:p>
+        </w:tc>
+      </w:tr>
+      <w:tr>
+        <w:tc>
+          <w:tcPr>
+            <w:tcW w:type="dxa" w:w="2880"/>
+          </w:tcPr>
+          <w:p>
+            <w:r>
+              <w:rPr>
+                <w:sz w:val="18"/>
+              </w:rPr>
+              <w:t>Two-Stage</w:t>
+            </w:r>
+          </w:p>
+        </w:tc>
+        <w:tc>
+          <w:tcPr>
+            <w:tcW w:type="dxa" w:w="2880"/>
+          </w:tcPr>
+          <w:p>
+            <w:r>
+              <w:rPr>
+                <w:sz w:val="18"/>
+              </w:rPr>
+              <w:t>PV(high-growth dividends) + PV(stable terminal)</w:t>
+            </w:r>
+          </w:p>
+        </w:tc>
+        <w:tc>
+          <w:tcPr>
+            <w:tcW w:type="dxa" w:w="2880"/>
+          </w:tcPr>
+          <w:p>
+            <w:r>
+              <w:rPr>
+                <w:sz w:val="18"/>
+              </w:rPr>
+              <w:t>Companies transitioning growth rates</w:t>
+            </w:r>
+          </w:p>
+        </w:tc>
+      </w:tr>
+      <w:tr>
+        <w:tc>
+          <w:tcPr>
+            <w:tcW w:type="dxa" w:w="2880"/>
+          </w:tcPr>
+          <w:p>
+            <w:r>
+              <w:rPr>
+                <w:sz w:val="18"/>
+              </w:rPr>
+              <w:t>H-Model</w:t>
+            </w:r>
+          </w:p>
+        </w:tc>
+        <w:tc>
+          <w:tcPr>
+            <w:tcW w:type="dxa" w:w="2880"/>
+          </w:tcPr>
+          <w:p>
+            <w:r>
+              <w:rPr>
+                <w:sz w:val="18"/>
+              </w:rPr>
+              <w:t>DPS x (1+gL) / (Ke-gL) + DPS x H x (gS-gL) / (Ke-gL)</w:t>
+            </w:r>
+          </w:p>
+        </w:tc>
+        <w:tc>
+          <w:tcPr>
+            <w:tcW w:type="dxa" w:w="2880"/>
+          </w:tcPr>
+          <w:p>
+            <w:r>
+              <w:rPr>
+                <w:sz w:val="18"/>
+              </w:rPr>
+              <w:t>Gradually declining growth</w:t>
+            </w:r>
+          </w:p>
+        </w:tc>
+      </w:tr>
+    </w:tbl>
+    <w:p/>
+    <w:p>
+      <w:r>
+        <w:t>DDMResult interface: gordonGrowth, twoStage, hModel (each number|null), applicable boolean, message string.</w:t>
+      </w:r>
+    </w:p>
+    <w:p>
+      <w:pPr>
+        <w:pStyle w:val="Heading1"/>
+      </w:pPr>
+      <w:r>
+        <w:t>Appendix C: EAS / IFRS Compliance Module</w:t>
+      </w:r>
+    </w:p>
+    <w:p>
+      <w:r>
+        <w:t>File: src/utils/easModules.ts</w:t>
+      </w:r>
+    </w:p>
+    <w:p>
+      <w:r>
+        <w:t>Four Egyptian Accounting Standards compliance modules with IFRS equivalents. Each function is pure, taking inputs and returning structured results.</w:t>
+      </w:r>
+    </w:p>
+    <w:p>
+      <w:pPr>
+        <w:pStyle w:val="Heading2"/>
+      </w:pPr>
+      <w:r>
+        <w:t>C.1 EAS 48 (IFRS 16) - Lease Adjustments</w:t>
+      </w:r>
+    </w:p>
+    <w:p>
+      <w:r>
+        <w:t>Function: calculateLeaseAdjustment(inputs, currentEBITDA, currentTotalDebt)</w:t>
+      </w:r>
+    </w:p>
+    <w:p>
+      <w:pPr>
+        <w:pStyle w:val="ListBullet"/>
+      </w:pPr>
+      <w:r>
+        <w:t>Capitalizes operating leases onto the balance sheet as Right-of-Use (ROU) assets</w:t>
+      </w:r>
+    </w:p>
+    <w:p>
+      <w:pPr>
+        <w:pStyle w:val="ListBullet"/>
+      </w:pPr>
+      <w:r>
+        <w:t>ROU Asset = PV of remaining lease payments at Incremental Borrowing Rate (IBR)</w:t>
+      </w:r>
+    </w:p>
+    <w:p>
+      <w:pPr>
+        <w:pStyle w:val="ListBullet"/>
+      </w:pPr>
+      <w:r>
+        <w:t>Formula: PV = PMT x [(1 - (1+r)^-n) / r]</w:t>
+      </w:r>
+    </w:p>
+    <w:p>
+      <w:pPr>
+        <w:pStyle w:val="ListBullet"/>
+      </w:pPr>
+      <w:r>
+        <w:t>EBITDA add-back = full annual lease payment (reclassified from operating to financing)</w:t>
+      </w:r>
+    </w:p>
+    <w:p>
+      <w:pPr>
+        <w:pStyle w:val="ListBullet"/>
+      </w:pPr>
+      <w:r>
+        <w:t>Debt increase = lease liability (equal to ROU asset value at inception)</w:t>
+      </w:r>
+    </w:p>
+    <w:p>
+      <w:pPr>
+        <w:pStyle w:val="ListBullet"/>
+      </w:pPr>
+      <w:r>
+        <w:t>Depreciation = ROU / remaining term (straight-line)</w:t>
+      </w:r>
+    </w:p>
+    <w:p>
+      <w:pPr>
+        <w:pStyle w:val="ListBullet"/>
+      </w:pPr>
+      <w:r>
+        <w:t>Interest expense = lease liability x IBR (Year 1)</w:t>
+      </w:r>
+    </w:p>
+    <w:p>
+      <w:pPr>
+        <w:pStyle w:val="Heading2"/>
+      </w:pPr>
+      <w:r>
+        <w:t>C.2 EAS 31 (IAS 1) - Normalized Earnings</w:t>
+      </w:r>
+    </w:p>
+    <w:p>
+      <w:r>
+        <w:t>Function: calculateNormalizedEarnings(items, reportedNI, taxRate, shares)</w:t>
+      </w:r>
+    </w:p>
+    <w:p>
+      <w:pPr>
+        <w:pStyle w:val="ListBullet"/>
+      </w:pPr>
+      <w:r>
+        <w:t>Adds back / deducts non-recurring items from reported Net Income</w:t>
+      </w:r>
+    </w:p>
+    <w:p>
+      <w:pPr>
+        <w:pStyle w:val="ListBullet"/>
+      </w:pPr>
+      <w:r>
+        <w:t>Tax-affected items are adjusted at the marginal tax rate</w:t>
+      </w:r>
+    </w:p>
+    <w:p>
+      <w:pPr>
+        <w:pStyle w:val="ListBullet"/>
+      </w:pPr>
+      <w:r>
+        <w:t>Common add-backs: impairment charges, restructuring costs, legal settlements</w:t>
+      </w:r>
+    </w:p>
+    <w:p>
+      <w:pPr>
+        <w:pStyle w:val="ListBullet"/>
+      </w:pPr>
+      <w:r>
+        <w:t>Common deductions: gain on asset sale, insurance proceeds, one-time subsidies</w:t>
+      </w:r>
+    </w:p>
+    <w:p>
+      <w:pPr>
+        <w:pStyle w:val="ListBullet"/>
+      </w:pPr>
+      <w:r>
+        <w:t>Returns: grossAdjustment, taxEffect, netAdjustment, normalizedNI, normalizedEPS</w:t>
+      </w:r>
+    </w:p>
+    <w:p>
+      <w:pPr>
+        <w:pStyle w:val="Heading2"/>
+      </w:pPr>
+      <w:r>
+        <w:t>C.3 EAS 12 (IAS 12) - Deferred Tax in EV Bridge</w:t>
+      </w:r>
+    </w:p>
+    <w:p>
+      <w:r>
+        <w:t>Function: calculateDeferredTaxAdjustment(inputs, baseEquityValue)</w:t>
+      </w:r>
+    </w:p>
+    <w:p>
+      <w:pPr>
+        <w:pStyle w:val="ListBullet"/>
+      </w:pPr>
+      <w:r>
+        <w:t>Net DTA (DTA &gt; DTL) adds to equity value (future tax savings)</w:t>
+      </w:r>
+    </w:p>
+    <w:p>
+      <w:pPr>
+        <w:pStyle w:val="ListBullet"/>
+      </w:pPr>
+      <w:r>
+        <w:t>Net DTL (DTL &gt; DTA) reduces equity value (future tax obligations)</w:t>
+      </w:r>
+    </w:p>
+    <w:p>
+      <w:pPr>
+        <w:pStyle w:val="ListBullet"/>
+      </w:pPr>
+      <w:r>
+        <w:t>Adjusted Equity = Base Equity Value + Net DTA</w:t>
+      </w:r>
+    </w:p>
+    <w:p>
+      <w:pPr>
+        <w:pStyle w:val="Heading2"/>
+      </w:pPr>
+      <w:r>
+        <w:t>C.4 EAS 23 (IAS 33) - Basic &amp; Diluted EPS</w:t>
+      </w:r>
+    </w:p>
+    <w:p>
+      <w:r>
+        <w:t>Function: calculateEPS(netIncome, basicShares, dilutedShares, convertibleInterest)</w:t>
+      </w:r>
+    </w:p>
+    <w:p>
+      <w:pPr>
+        <w:pStyle w:val="ListBullet"/>
+      </w:pPr>
+      <w:r>
+        <w:t>Basic EPS = Net Income / Weighted Average Basic Shares</w:t>
+      </w:r>
+    </w:p>
+    <w:p>
+      <w:pPr>
+        <w:pStyle w:val="ListBullet"/>
+      </w:pPr>
+      <w:r>
+        <w:t>Diluted EPS = (NI + Convertible Interest) / (Basic + Dilutive Shares)</w:t>
+      </w:r>
+    </w:p>
+    <w:p>
+      <w:pPr>
+        <w:pStyle w:val="ListBullet"/>
+      </w:pPr>
+      <w:r>
+        <w:t>Anti-dilution check: if Diluted EPS &gt; Basic EPS, dilutive securities are excluded</w:t>
+      </w:r>
+    </w:p>
+    <w:p>
+      <w:pPr>
+        <w:pStyle w:val="ListBullet"/>
+      </w:pPr>
+      <w:r>
+        <w:t>Returns: basicEPS, dilutedEPS, dilutionPercent, isAntiDilutive flag</w:t>
+      </w:r>
+    </w:p>
+    <w:p>
+      <w:pPr>
+        <w:pStyle w:val="Heading1"/>
+      </w:pPr>
+      <w:r>
+        <w:t>Appendix D: Model Confidence Score (0-100)</w:t>
+      </w:r>
+    </w:p>
+    <w:p>
+      <w:r>
+        <w:t>File: src/utils/confidenceScore.ts - calculateConfidenceScore()</w:t>
+      </w:r>
+    </w:p>
+    <w:p>
+      <w:r>
+        <w:t>Three-pillar scoring system that evaluates the reliability of the valuation model. Total score maps to letter grade: A (85+), B (70+), C (55+), D (40+), F (&lt;40).</w:t>
+      </w:r>
+    </w:p>
+    <w:tbl>
+      <w:tblPr>
+        <w:tblStyle w:val="LightGrid-Accent1"/>
+        <w:tblW w:type="auto" w:w="0"/>
+        <w:jc w:val="center"/>
+        <w:tblLook w:firstColumn="1" w:firstRow="1" w:lastColumn="0" w:lastRow="0" w:noHBand="0" w:noVBand="1" w:val="04A0"/>
+      </w:tblPr>
+      <w:tblGrid>
+        <w:gridCol w:w="2880"/>
+        <w:gridCol w:w="2880"/>
+        <w:gridCol w:w="2880"/>
+      </w:tblGrid>
+      <w:tr>
+        <w:tc>
+          <w:tcPr>
+            <w:tcW w:type="dxa" w:w="2880"/>
+          </w:tcPr>
+          <w:p>
+            <w:r>
+              <w:rPr>
+                <w:b/>
+                <w:sz w:val="18"/>
+              </w:rPr>
+              <w:t>Pillar</w:t>
+            </w:r>
+          </w:p>
+        </w:tc>
+        <w:tc>
+          <w:tcPr>
+            <w:tcW w:type="dxa" w:w="2880"/>
+          </w:tcPr>
+          <w:p>
+            <w:r>
+              <w:rPr>
+                <w:b/>
+                <w:sz w:val="18"/>
+              </w:rPr>
+              <w:t>Max Points</w:t>
+            </w:r>
+          </w:p>
+        </w:tc>
+        <w:tc>
+          <w:tcPr>
+            <w:tcW w:type="dxa" w:w="2880"/>
+          </w:tcPr>
+          <w:p>
+            <w:r>
+              <w:rPr>
+                <w:b/>
+                <w:sz w:val="18"/>
+              </w:rPr>
+              <w:t>Checks</w:t>
+            </w:r>
+          </w:p>
+        </w:tc>
+      </w:tr>
+      <w:tr>
+        <w:tc>
+          <w:tcPr>
+            <w:tcW w:type="dxa" w:w="2880"/>
+          </w:tcPr>
+          <w:p>
+            <w:r>
+              <w:rPr>
+                <w:sz w:val="18"/>
+              </w:rPr>
+              <w:t>Data Quality</w:t>
+            </w:r>
+          </w:p>
+        </w:tc>
+        <w:tc>
+          <w:tcPr>
+            <w:tcW w:type="dxa" w:w="2880"/>
+          </w:tcPr>
+          <w:p>
+            <w:r>
+              <w:rPr>
+                <w:sz w:val="18"/>
+              </w:rPr>
+              <w:t>30 pts</w:t>
+            </w:r>
+          </w:p>
+        </w:tc>
+        <w:tc>
+          <w:tcPr>
+            <w:tcW w:type="dxa" w:w="2880"/>
+          </w:tcPr>
+          <w:p>
+            <w:r>
+              <w:rPr>
+                <w:sz w:val="18"/>
+              </w:rPr>
+              <w:t>D&amp;A&gt;0 (5), CapEx&gt;0 (5), Interest consistency (5), EBITDA&gt;0 (5), Revenue&gt;0 (5), Shares&gt;0 (5)</w:t>
+            </w:r>
+          </w:p>
+        </w:tc>
+      </w:tr>
+      <w:tr>
+        <w:tc>
+          <w:tcPr>
+            <w:tcW w:type="dxa" w:w="2880"/>
+          </w:tcPr>
+          <w:p>
+            <w:r>
+              <w:rPr>
+                <w:sz w:val="18"/>
+              </w:rPr>
+              <w:t>Assumption Reasonableness</w:t>
+            </w:r>
+          </w:p>
+        </w:tc>
+        <w:tc>
+          <w:tcPr>
+            <w:tcW w:type="dxa" w:w="2880"/>
+          </w:tcPr>
+          <w:p>
+            <w:r>
+              <w:rPr>
+                <w:sz w:val="18"/>
+              </w:rPr>
+              <w:t>40 pts</w:t>
+            </w:r>
+          </w:p>
+        </w:tc>
+        <w:tc>
+          <w:tcPr>
+            <w:tcW w:type="dxa" w:w="2880"/>
+          </w:tcPr>
+          <w:p>
+            <w:r>
+              <w:rPr>
+                <w:sz w:val="18"/>
+              </w:rPr>
+              <w:t>Rev growth&lt;=25% (8), EBITDA margin&lt;=50% (8), Terminal g&lt;GDP (8), WACC 15-35% (8), FCFF reconciles (8)</w:t>
+            </w:r>
+          </w:p>
+        </w:tc>
+      </w:tr>
+      <w:tr>
+        <w:tc>
+          <w:tcPr>
+            <w:tcW w:type="dxa" w:w="2880"/>
+          </w:tcPr>
+          <w:p>
+            <w:r>
+              <w:rPr>
+                <w:sz w:val="18"/>
+              </w:rPr>
+              <w:t>Model Robustness</w:t>
+            </w:r>
+          </w:p>
+        </w:tc>
+        <w:tc>
+          <w:tcPr>
+            <w:tcW w:type="dxa" w:w="2880"/>
+          </w:tcPr>
+          <w:p>
+            <w:r>
+              <w:rPr>
+                <w:sz w:val="18"/>
+              </w:rPr>
+              <w:t>30 pts</w:t>
+            </w:r>
+          </w:p>
+        </w:tc>
+        <w:tc>
+          <w:tcPr>
+            <w:tcW w:type="dxa" w:w="2880"/>
+          </w:tcPr>
+          <w:p>
+            <w:r>
+              <w:rPr>
+                <w:sz w:val="18"/>
+              </w:rPr>
+              <w:t>TV&lt;80% of EV (10), Value within +/-50% of market (10), DCF/DDM agreement (5), Interest coverage&gt;1.5x (5)</w:t>
+            </w:r>
+          </w:p>
+        </w:tc>
+      </w:tr>
+    </w:tbl>
+    <w:p/>
+    <w:p>
+      <w:r>
+        <w:t>Returns: totalScore, grade (A-F), per-pillar scores, detailed breakdown array with per-check scores, and a narrative explanation of concerns.</w:t>
+      </w:r>
+    </w:p>
+    <w:p>
+      <w:pPr>
+        <w:pStyle w:val="Heading1"/>
+      </w:pPr>
+      <w:r>
+        <w:t>Appendix E: Input Validation Engine</w:t>
+      </w:r>
+    </w:p>
+    <w:p>
+      <w:r>
+        <w:t>File: src/utils/inputValidation.ts - validateInputs()</w:t>
+      </w:r>
+    </w:p>
+    <w:p>
+      <w:r>
+        <w:t>Three severity levels with distinct behavior:</w:t>
+      </w:r>
+    </w:p>
+    <w:p>
+      <w:pPr>
+        <w:pStyle w:val="Heading2"/>
+      </w:pPr>
+      <w:r>
+        <w:t>Hard Blocks (Must Fix)</w:t>
+      </w:r>
+    </w:p>
+    <w:p>
+      <w:pPr>
+        <w:pStyle w:val="ListBullet"/>
+      </w:pPr>
+      <w:r>
+        <w:t>Revenue &lt;= 0: Cannot perform valuation without revenue</w:t>
+      </w:r>
+    </w:p>
+    <w:p>
+      <w:pPr>
+        <w:pStyle w:val="ListBullet"/>
+      </w:pPr>
+      <w:r>
+        <w:t>Shares Outstanding &lt;= 0: Cannot calculate per-share values</w:t>
+      </w:r>
+    </w:p>
+    <w:p>
+      <w:pPr>
+        <w:pStyle w:val="ListBullet"/>
+      </w:pPr>
+      <w:r>
+        <w:t>WACC &lt;= Terminal Growth: Gordon Growth Model produces infinite/negative TV</w:t>
+      </w:r>
+    </w:p>
+    <w:p>
+      <w:pPr>
+        <w:pStyle w:val="ListBullet"/>
+      </w:pPr>
+      <w:r>
+        <w:t>WACC &lt;= 0: Invalid discount rate</w:t>
+      </w:r>
+    </w:p>
+    <w:p>
+      <w:pPr>
+        <w:pStyle w:val="ListBullet"/>
+      </w:pPr>
+      <w:r>
+        <w:t>Projection Years &lt; 1 or &gt; 20: Out of reasonable range</w:t>
+      </w:r>
+    </w:p>
+    <w:p>
+      <w:pPr>
+        <w:pStyle w:val="ListBullet"/>
+      </w:pPr>
+      <w:r>
+        <w:t>Stock Price &lt;= 0: Cannot calculate upside/downside</w:t>
+      </w:r>
+    </w:p>
+    <w:p>
+      <w:pPr>
+        <w:pStyle w:val="ListBullet"/>
+      </w:pPr>
+      <w:r>
+        <w:t>EBITDA Margin &lt;= 0% or &gt; 95%: Unrealistic operating profile</w:t>
+      </w:r>
+    </w:p>
+    <w:p>
+      <w:pPr>
+        <w:pStyle w:val="ListBullet"/>
+      </w:pPr>
+      <w:r>
+        <w:t>Revenue Growth &gt; 100%: Unreasonably aggressive</w:t>
+      </w:r>
+    </w:p>
+    <w:p>
+      <w:pPr>
+        <w:pStyle w:val="ListBullet"/>
+      </w:pPr>
+      <w:r>
+        <w:t>Tax Rate &lt; 0% or &gt; 60%: Out of legal range</w:t>
+      </w:r>
+    </w:p>
+    <w:p>
+      <w:pPr>
+        <w:pStyle w:val="Heading2"/>
+      </w:pPr>
+      <w:r>
+        <w:t>Soft Warnings (Review Recommended)</w:t>
+      </w:r>
+    </w:p>
+    <w:p>
+      <w:pPr>
+        <w:pStyle w:val="ListBullet"/>
+      </w:pPr>
+      <w:r>
+        <w:t>Terminal Value &gt; 80% of EV: Model relies too heavily on terminal assumptions</w:t>
+      </w:r>
+    </w:p>
+    <w:p>
+      <w:pPr>
+        <w:pStyle w:val="ListBullet"/>
+      </w:pPr>
+      <w:r>
+        <w:t>Implied price deviates &gt; 50% from market: May indicate aggressive assumptions</w:t>
+      </w:r>
+    </w:p>
+    <w:p>
+      <w:pPr>
+        <w:pStyle w:val="ListBullet"/>
+      </w:pPr>
+      <w:r>
+        <w:t>Negative FCF in base year: DCF may extrapolate losses</w:t>
+      </w:r>
+    </w:p>
+    <w:p>
+      <w:pPr>
+        <w:pStyle w:val="ListBullet"/>
+      </w:pPr>
+      <w:r>
+        <w:t>Interest Coverage &lt; 1.5x: Company may face debt service issues</w:t>
+      </w:r>
+    </w:p>
+    <w:p>
+      <w:pPr>
+        <w:pStyle w:val="ListBullet"/>
+      </w:pPr>
+      <w:r>
+        <w:t>D&amp;A = 0 with positive PP&amp;E: May understate reinvestment needs</w:t>
+      </w:r>
+    </w:p>
+    <w:p>
+      <w:pPr>
+        <w:pStyle w:val="ListBullet"/>
+      </w:pPr>
+      <w:r>
+        <w:t>CapEx = 0: FCFF may be overstated</w:t>
+      </w:r>
+    </w:p>
+    <w:p>
+      <w:pPr>
+        <w:pStyle w:val="ListBullet"/>
+      </w:pPr>
+      <w:r>
+        <w:t>Revenue growth &gt; 25%: Aggressive for most companies</w:t>
+      </w:r>
+    </w:p>
+    <w:p>
+      <w:pPr>
+        <w:pStyle w:val="ListBullet"/>
+      </w:pPr>
+      <w:r>
+        <w:t>Debt/Equity &gt; 3.0: Highly leveraged</w:t>
+      </w:r>
+    </w:p>
+    <w:p>
+      <w:pPr>
+        <w:pStyle w:val="Heading2"/>
+      </w:pPr>
+      <w:r>
+        <w:t>Edge Case Auto-Adjustments</w:t>
+      </w:r>
+    </w:p>
+    <w:p>
+      <w:pPr>
+        <w:pStyle w:val="ListBullet"/>
+      </w:pPr>
+      <w:r>
+        <w:t>Zero interest expense with positive debt: Impute at ~2.8% of total debt</w:t>
+      </w:r>
+    </w:p>
+    <w:p>
+      <w:pPr>
+        <w:pStyle w:val="ListBullet"/>
+      </w:pPr>
+      <w:r>
+        <w:t>COGS = 0 for banks: Recalculate as Revenue - Interest Expense</w:t>
+      </w:r>
+    </w:p>
+    <w:p>
+      <w:pPr>
+        <w:pStyle w:val="ListBullet"/>
+      </w:pPr>
+      <w:r>
+        <w:t>Negative equity: Flag but allow calculation to proceed</w:t>
+      </w:r>
+    </w:p>
+    <w:p>
+      <w:pPr>
+        <w:pStyle w:val="ListBullet"/>
+      </w:pPr>
+      <w:r>
+        <w:t>Missing D&amp;A: Default to 0 with warning</w:t>
+      </w:r>
+    </w:p>
+    <w:p>
+      <w:pPr>
+        <w:pStyle w:val="Heading1"/>
+      </w:pPr>
+      <w:r>
+        <w:t>Appendix F: JSON Export (CFA-Grade)</w:t>
+      </w:r>
+    </w:p>
+    <w:p>
+      <w:r>
+        <w:t>File: src/utils/jsonExport.ts</w:t>
+      </w:r>
+    </w:p>
+    <w:p>
+      <w:r>
+        <w:t>Generates a fully-compliant JSON export with complete metadata and audit trail. Engine version: 4.0.0. Schema follows Section 8.4 specification.</w:t>
+      </w:r>
+    </w:p>
+    <w:p>
+      <w:r>
+        <w:t>The JSON structure contains three top-level sections:</w:t>
+      </w:r>
+    </w:p>
+    <w:tbl>
+      <w:tblPr>
+        <w:tblStyle w:val="LightGrid-Accent1"/>
+        <w:tblW w:type="auto" w:w="0"/>
+        <w:jc w:val="center"/>
+        <w:tblLook w:firstColumn="1" w:firstRow="1" w:lastColumn="0" w:lastRow="0" w:noHBand="0" w:noVBand="1" w:val="04A0"/>
+      </w:tblPr>
+      <w:tblGrid>
+        <w:gridCol w:w="4320"/>
+        <w:gridCol w:w="4320"/>
+      </w:tblGrid>
+      <w:tr>
+        <w:tc>
+          <w:tcPr>
+            <w:tcW w:type="dxa" w:w="4320"/>
+          </w:tcPr>
+          <w:p>
+            <w:r>
+              <w:rPr>
+                <w:b/>
+                <w:sz w:val="18"/>
+              </w:rPr>
+              <w:t>Section</w:t>
+            </w:r>
+          </w:p>
+        </w:tc>
+        <w:tc>
+          <w:tcPr>
+            <w:tcW w:type="dxa" w:w="4320"/>
+          </w:tcPr>
+          <w:p>
+            <w:r>
+              <w:rPr>
+                <w:b/>
+                <w:sz w:val="18"/>
+              </w:rPr>
+              <w:t>Contents</w:t>
+            </w:r>
+          </w:p>
+        </w:tc>
+      </w:tr>
+      <w:tr>
+        <w:tc>
+          <w:tcPr>
+            <w:tcW w:type="dxa" w:w="4320"/>
+          </w:tcPr>
+          <w:p>
+            <w:r>
+              <w:rPr>
+                <w:sz w:val="18"/>
+              </w:rPr>
+              <w:t>metadata</w:t>
+            </w:r>
+          </w:p>
+        </w:tc>
+        <w:tc>
+          <w:tcPr>
+            <w:tcW w:type="dxa" w:w="4320"/>
+          </w:tcPr>
+          <w:p>
+            <w:r>
+              <w:rPr>
+                <w:sz w:val="18"/>
+              </w:rPr>
+              <w:t>engine_version, generation_date, currency, company_name, capm_method, rf_instrument, rf_date, discounting_convention, accounting_standard</w:t>
+            </w:r>
+          </w:p>
+        </w:tc>
+      </w:tr>
+      <w:tr>
+        <w:tc>
+          <w:tcPr>
+            <w:tcW w:type="dxa" w:w="4320"/>
+          </w:tcPr>
+          <w:p>
+            <w:r>
+              <w:rPr>
+                <w:sz w:val="18"/>
+              </w:rPr>
+              <w:t>inputs</w:t>
+            </w:r>
+          </w:p>
+        </w:tc>
+        <w:tc>
+          <w:tcPr>
+            <w:tcW w:type="dxa" w:w="4320"/>
+          </w:tcPr>
+          <w:p>
+            <w:r>
+              <w:rPr>
+                <w:sz w:val="18"/>
+              </w:rPr>
+              <w:t>All financial data fields, all assumption parameters (25+ fields)</w:t>
+            </w:r>
+          </w:p>
+        </w:tc>
+      </w:tr>
+      <w:tr>
+        <w:tc>
+          <w:tcPr>
+            <w:tcW w:type="dxa" w:w="4320"/>
+          </w:tcPr>
+          <w:p>
+            <w:r>
+              <w:rPr>
+                <w:sz w:val="18"/>
+              </w:rPr>
+              <w:t>calculated</w:t>
+            </w:r>
+          </w:p>
+        </w:tc>
+        <w:tc>
+          <w:tcPr>
+            <w:tcW w:type="dxa" w:w="4320"/>
+          </w:tcPr>
+          <w:p>
+            <w:r>
+              <w:rPr>
+                <w:sz w:val="18"/>
+              </w:rPr>
+              <w:t>WACC result, DCF result with full projections and EV bridge, DDM result, comparable multiples, sensitivity matrix, financial ratios, FCFF verification, scenario analysis</w:t>
+            </w:r>
+          </w:p>
+        </w:tc>
+      </w:tr>
+    </w:tbl>
+    <w:p/>
+    <w:p>
+      <w:pPr>
+        <w:pStyle w:val="Heading1"/>
+      </w:pPr>
+      <w:r>
+        <w:t>Appendix G: Updated Valuation Section Components</w:t>
+      </w:r>
+    </w:p>
+    <w:p>
+      <w:r>
+        <w:t>File: src/components/valuation/sections/ (14 components)</w:t>
+      </w:r>
+    </w:p>
+    <w:tbl>
+      <w:tblPr>
+        <w:tblStyle w:val="LightGrid-Accent1"/>
+        <w:tblW w:type="auto" w:w="0"/>
+        <w:jc w:val="center"/>
+        <w:tblLook w:firstColumn="1" w:firstRow="1" w:lastColumn="0" w:lastRow="0" w:noHBand="0" w:noVBand="1" w:val="04A0"/>
+      </w:tblPr>
+      <w:tblGrid>
+        <w:gridCol w:w="4320"/>
+        <w:gridCol w:w="4320"/>
+      </w:tblGrid>
+      <w:tr>
+        <w:tc>
+          <w:tcPr>
+            <w:tcW w:type="dxa" w:w="4320"/>
+          </w:tcPr>
+          <w:p>
+            <w:r>
+              <w:rPr>
+                <w:b/>
+                <w:sz w:val="18"/>
+              </w:rPr>
+              <w:t>Component</w:t>
+            </w:r>
+          </w:p>
+        </w:tc>
+        <w:tc>
+          <w:tcPr>
+            <w:tcW w:type="dxa" w:w="4320"/>
+          </w:tcPr>
+          <w:p>
+            <w:r>
+              <w:rPr>
+                <w:b/>
+                <w:sz w:val="18"/>
+              </w:rPr>
+              <w:t>Purpose</w:t>
+            </w:r>
+          </w:p>
+        </w:tc>
+      </w:tr>
+      <w:tr>
+        <w:tc>
+          <w:tcPr>
+            <w:tcW w:type="dxa" w:w="4320"/>
+          </w:tcPr>
+          <w:p>
+            <w:r>
+              <w:rPr>
+                <w:sz w:val="18"/>
+              </w:rPr>
+              <w:t>ValidationAlerts.tsx</w:t>
+            </w:r>
+          </w:p>
+        </w:tc>
+        <w:tc>
+          <w:tcPr>
+            <w:tcW w:type="dxa" w:w="4320"/>
+          </w:tcPr>
+          <w:p>
+            <w:r>
+              <w:rPr>
+                <w:sz w:val="18"/>
+              </w:rPr>
+              <w:t>Market-specific validation warnings with severity levels</w:t>
+            </w:r>
+          </w:p>
+        </w:tc>
+      </w:tr>
+      <w:tr>
+        <w:tc>
+          <w:tcPr>
+            <w:tcW w:type="dxa" w:w="4320"/>
+          </w:tcPr>
+          <w:p>
+            <w:r>
+              <w:rPr>
+                <w:sz w:val="18"/>
+              </w:rPr>
+              <w:t>ValuationStyleSelector.tsx</w:t>
+            </w:r>
+          </w:p>
+        </w:tc>
+        <w:tc>
+          <w:tcPr>
+            <w:tcW w:type="dxa" w:w="4320"/>
+          </w:tcPr>
+          <w:p>
+            <w:r>
+              <w:rPr>
+                <w:sz w:val="18"/>
+              </w:rPr>
+              <w:t>Conservative/Moderate/Aggressive with side-by-side DCF comparison</w:t>
+            </w:r>
+          </w:p>
+        </w:tc>
+      </w:tr>
+      <w:tr>
+        <w:tc>
+          <w:tcPr>
+            <w:tcW w:type="dxa" w:w="4320"/>
+          </w:tcPr>
+          <w:p>
+            <w:r>
+              <w:rPr>
+                <w:sz w:val="18"/>
+              </w:rPr>
+              <w:t>MarketVsFundamental.tsx</w:t>
+            </w:r>
+          </w:p>
+        </w:tc>
+        <w:tc>
+          <w:tcPr>
+            <w:tcW w:type="dxa" w:w="4320"/>
+          </w:tcPr>
+          <w:p>
+            <w:r>
+              <w:rPr>
+                <w:sz w:val="18"/>
+              </w:rPr>
+              <w:t>Market price vs intrinsic value with key statistics</w:t>
+            </w:r>
+          </w:p>
+        </w:tc>
+      </w:tr>
+      <w:tr>
+        <w:tc>
+          <w:tcPr>
+            <w:tcW w:type="dxa" w:w="4320"/>
+          </w:tcPr>
+          <w:p>
+            <w:r>
+              <w:rPr>
+                <w:sz w:val="18"/>
+              </w:rPr>
+              <w:t>ScenarioAnalysis.tsx</w:t>
+            </w:r>
+          </w:p>
+        </w:tc>
+        <w:tc>
+          <w:tcPr>
+            <w:tcW w:type="dxa" w:w="4320"/>
+          </w:tcPr>
+          <w:p>
+            <w:r>
+              <w:rPr>
+                <w:sz w:val="18"/>
+              </w:rPr>
+              <w:t>Bear/Base/Bull with sensitivity matrix and Monte Carlo</w:t>
+            </w:r>
+          </w:p>
+        </w:tc>
+      </w:tr>
+      <w:tr>
+        <w:tc>
+          <w:tcPr>
+            <w:tcW w:type="dxa" w:w="4320"/>
+          </w:tcPr>
+          <w:p>
+            <w:r>
+              <w:rPr>
+                <w:sz w:val="18"/>
+              </w:rPr>
+              <w:t>ValuationSummaryCards.tsx</w:t>
+            </w:r>
+          </w:p>
+        </w:tc>
+        <w:tc>
+          <w:tcPr>
+            <w:tcW w:type="dxa" w:w="4320"/>
+          </w:tcPr>
+          <w:p>
+            <w:r>
+              <w:rPr>
+                <w:sz w:val="18"/>
+              </w:rPr>
+              <w:t>DCF, DDM, Comps, and Blended value cards</w:t>
+            </w:r>
+          </w:p>
+        </w:tc>
+      </w:tr>
+      <w:tr>
+        <w:tc>
+          <w:tcPr>
+            <w:tcW w:type="dxa" w:w="4320"/>
+          </w:tcPr>
+          <w:p>
+            <w:r>
+              <w:rPr>
+                <w:sz w:val="18"/>
+              </w:rPr>
+              <w:t>BlendedWeightSlider.tsx</w:t>
+            </w:r>
+          </w:p>
+        </w:tc>
+        <w:tc>
+          <w:tcPr>
+            <w:tcW w:type="dxa" w:w="4320"/>
+          </w:tcPr>
+          <w:p>
+            <w:r>
+              <w:rPr>
+                <w:sz w:val="18"/>
+              </w:rPr>
+              <w:t>Adjustable DCF/Comps weighting with live preview</w:t>
+            </w:r>
+          </w:p>
+        </w:tc>
+      </w:tr>
+      <w:tr>
+        <w:tc>
+          <w:tcPr>
+            <w:tcW w:type="dxa" w:w="4320"/>
+          </w:tcPr>
+          <w:p>
+            <w:r>
+              <w:rPr>
+                <w:sz w:val="18"/>
+              </w:rPr>
+              <w:t>ComparableBreakdown.tsx</w:t>
+            </w:r>
+          </w:p>
+        </w:tc>
+        <w:tc>
+          <w:tcPr>
+            <w:tcW w:type="dxa" w:w="4320"/>
+          </w:tcPr>
+          <w:p>
+            <w:r>
+              <w:rPr>
+                <w:sz w:val="18"/>
+              </w:rPr>
+              <w:t>Individual method implied prices (P/E, EV/EBITDA, P/S, P/B)</w:t>
+            </w:r>
+          </w:p>
+        </w:tc>
+      </w:tr>
+      <w:tr>
+        <w:tc>
+          <w:tcPr>
+            <w:tcW w:type="dxa" w:w="4320"/>
+          </w:tcPr>
+          <w:p>
+            <w:r>
+              <w:rPr>
+                <w:sz w:val="18"/>
+              </w:rPr>
+              <w:t>BaseYearFCF.tsx</w:t>
+            </w:r>
+          </w:p>
+        </w:tc>
+        <w:tc>
+          <w:tcPr>
+            <w:tcW w:type="dxa" w:w="4320"/>
+          </w:tcPr>
+          <w:p>
+            <w:r>
+              <w:rPr>
+                <w:sz w:val="18"/>
+              </w:rPr>
+              <w:t>Base year free cash flow breakdown</w:t>
+            </w:r>
+          </w:p>
+        </w:tc>
+      </w:tr>
+      <w:tr>
+        <w:tc>
+          <w:tcPr>
+            <w:tcW w:type="dxa" w:w="4320"/>
+          </w:tcPr>
+          <w:p>
+            <w:r>
+              <w:rPr>
+                <w:sz w:val="18"/>
+              </w:rPr>
+              <w:t>DCFProjectionsTable.tsx</w:t>
+            </w:r>
+          </w:p>
+        </w:tc>
+        <w:tc>
+          <w:tcPr>
+            <w:tcW w:type="dxa" w:w="4320"/>
+          </w:tcPr>
+          <w:p>
+            <w:r>
+              <w:rPr>
+                <w:sz w:val="18"/>
+              </w:rPr>
+              <w:t>Year-by-year revenue, EBITDA, D&amp;A, EBIT, NOPAT, CapEx, WC, FCFF</w:t>
+            </w:r>
+          </w:p>
+        </w:tc>
+      </w:tr>
+      <w:tr>
+        <w:tc>
+          <w:tcPr>
+            <w:tcW w:type="dxa" w:w="4320"/>
+          </w:tcPr>
+          <w:p>
+            <w:r>
+              <w:rPr>
+                <w:sz w:val="18"/>
+              </w:rPr>
+              <w:t>KeyMetricsGrid.tsx</w:t>
+            </w:r>
+          </w:p>
+        </w:tc>
+        <w:tc>
+          <w:tcPr>
+            <w:tcW w:type="dxa" w:w="4320"/>
+          </w:tcPr>
+          <w:p>
+            <w:r>
+              <w:rPr>
+                <w:sz w:val="18"/>
+              </w:rPr>
+              <w:t>30+ financial ratios in card format</w:t>
+            </w:r>
+          </w:p>
+        </w:tc>
+      </w:tr>
+      <w:tr>
+        <w:tc>
+          <w:tcPr>
+            <w:tcW w:type="dxa" w:w="4320"/>
+          </w:tcPr>
+          <w:p>
+            <w:r>
+              <w:rPr>
+                <w:sz w:val="18"/>
+              </w:rPr>
+              <w:t>ReverseDCFSection.tsx</w:t>
+            </w:r>
+          </w:p>
+        </w:tc>
+        <w:tc>
+          <w:tcPr>
+            <w:tcW w:type="dxa" w:w="4320"/>
+          </w:tcPr>
+          <w:p>
+            <w:r>
+              <w:rPr>
+                <w:sz w:val="18"/>
+              </w:rPr>
+              <w:t>Market-implied growth rate analysis</w:t>
+            </w:r>
+          </w:p>
+        </w:tc>
+      </w:tr>
+      <w:tr>
+        <w:tc>
+          <w:tcPr>
+            <w:tcW w:type="dxa" w:w="4320"/>
+          </w:tcPr>
+          <w:p>
+            <w:r>
+              <w:rPr>
+                <w:sz w:val="18"/>
+              </w:rPr>
+              <w:t>QualityScorecard.tsx</w:t>
+            </w:r>
+          </w:p>
+        </w:tc>
+        <w:tc>
+          <w:tcPr>
+            <w:tcW w:type="dxa" w:w="4320"/>
+          </w:tcPr>
+          <w:p>
+            <w:r>
+              <w:rPr>
+                <w:sz w:val="18"/>
+              </w:rPr>
+              <w:t>4-category quality assessment with letter grade</w:t>
+            </w:r>
+          </w:p>
+        </w:tc>
+      </w:tr>
+      <w:tr>
+        <w:tc>
+          <w:tcPr>
+            <w:tcW w:type="dxa" w:w="4320"/>
+          </w:tcPr>
+          <w:p>
+            <w:r>
+              <w:rPr>
+                <w:sz w:val="18"/>
+              </w:rPr>
+              <w:t>FCFFReconciliation.tsx</w:t>
+            </w:r>
+          </w:p>
+        </w:tc>
+        <w:tc>
+          <w:tcPr>
+            <w:tcW w:type="dxa" w:w="4320"/>
+          </w:tcPr>
+          <w:p>
+            <w:r>
+              <w:rPr>
+                <w:sz w:val="18"/>
+              </w:rPr>
+              <w:t>Three-method FCFF cross-verification display</w:t>
+            </w:r>
+          </w:p>
+        </w:tc>
+      </w:tr>
+      <w:tr>
+        <w:tc>
+          <w:tcPr>
+            <w:tcW w:type="dxa" w:w="4320"/>
+          </w:tcPr>
+          <w:p>
+            <w:r>
+              <w:rPr>
+                <w:sz w:val="18"/>
+              </w:rPr>
+              <w:t>EASComplianceSection.tsx</w:t>
+            </w:r>
+          </w:p>
+        </w:tc>
+        <w:tc>
+          <w:tcPr>
+            <w:tcW w:type="dxa" w:w="4320"/>
+          </w:tcPr>
+          <w:p>
+            <w:r>
+              <w:rPr>
+                <w:sz w:val="18"/>
+              </w:rPr>
+              <w:t>EAS 48/31/12/23 compliance panels with calculations</w:t>
+            </w:r>
+          </w:p>
+        </w:tc>
+      </w:tr>
+    </w:tbl>
+    <w:p/>
     <w:sectPr>
       <w:pgSz w:w="12240" w:h="15840"/>
       <w:pgMar w:top="1440" w:right="1800" w:bottom="1440" w:left="1800" w:header="720" w:footer="720" w:gutter="0"/>

</xml_diff>